<commit_message>
Refine resume layout and spacing
</commit_message>
<xml_diff>
--- a/docs/Reference/Marco_Morfin_Resume.docx
+++ b/docs/Reference/Marco_Morfin_Resume.docx
@@ -11,8 +11,8 @@
         <w:rPr>
           <w:rFonts w:ascii="Arial" w:hAnsi="Arial"/>
           <w:b/>
-          <w:color w:val="11161C"/>
-          <w:sz w:val="48"/>
+          <w:color w:val="14181D"/>
+          <w:sz w:val="50"/>
         </w:rPr>
         <w:t>Marco Morfin</w:t>
       </w:r>
@@ -24,45 +24,82 @@
       <w:r>
         <w:rPr>
           <w:rFonts w:ascii="Arial" w:hAnsi="Arial"/>
-          <w:b w:val="0"/>
-          <w:color w:val="51606F"/>
-          <w:sz w:val="18"/>
+          <w:color w:val="5F6975"/>
+          <w:sz w:val="17"/>
         </w:rPr>
         <w:t>Entertainment Business · Community Management · Esports Operations</w:t>
       </w:r>
     </w:p>
     <w:p>
       <w:pPr>
-        <w:spacing w:before="0" w:after="120" w:line="240" w:lineRule="auto"/>
-        <w:jc w:val="left"/>
+        <w:spacing w:before="0" w:after="160" w:line="240" w:lineRule="auto"/>
         <w:pBdr>
-          <w:bottom w:val="single" w:sz="8" w:space="1" w:color="D9DDE3"/>
+          <w:bottom w:val="single" w:sz="6" w:space="1" w:color="D4D9DF"/>
         </w:pBdr>
       </w:pPr>
       <w:r>
         <w:rPr>
           <w:rFonts w:ascii="Arial" w:hAnsi="Arial"/>
-          <w:color w:val="222A33"/>
-          <w:sz w:val="18"/>
+          <w:color w:val="58616C"/>
+          <w:sz w:val="17"/>
         </w:rPr>
         <w:t>Los Angeles, CA · (909) 441-6903 · m.m0rfiin@gmail.com · linkedin.com/in/marco-morfin · m0rfiin-m.github.io/m0rfiin-blog</w:t>
       </w:r>
     </w:p>
     <w:p>
       <w:pPr>
-        <w:spacing w:before="200" w:after="80" w:line="240" w:lineRule="auto"/>
+        <w:spacing w:before="240" w:after="100" w:line="240" w:lineRule="auto"/>
         <w:pBdr>
-          <w:bottom w:val="single" w:sz="8" w:space="1" w:color="D9DDE3"/>
+          <w:bottom w:val="single" w:sz="6" w:space="1" w:color="D4D9DF"/>
         </w:pBdr>
       </w:pPr>
       <w:r>
         <w:rPr>
           <w:rFonts w:ascii="Arial" w:hAnsi="Arial"/>
           <w:b/>
-          <w:color w:val="374655"/>
-          <w:sz w:val="20"/>
+          <w:color w:val="4F5964"/>
+          <w:sz w:val="19"/>
         </w:rPr>
         <w:t>PROFESSIONAL SUMMARY</w:t>
+      </w:r>
+    </w:p>
+    <w:p>
+      <w:pPr>
+        <w:spacing w:before="0" w:after="80" w:line="259" w:lineRule="auto"/>
+      </w:pPr>
+      <w:r>
+        <w:t>Entertainment business professional with 8+ years of experience across community management, esports operations, customer service, and technical support. Managed a 15,921-member Discord community, increased engagement by 35%, and developed sponsorship and operations materials for a sports marketing agency's esports division.</w:t>
+      </w:r>
+    </w:p>
+    <w:p>
+      <w:pPr>
+        <w:spacing w:before="240" w:after="100" w:line="240" w:lineRule="auto"/>
+        <w:pBdr>
+          <w:bottom w:val="single" w:sz="6" w:space="1" w:color="D4D9DF"/>
+        </w:pBdr>
+      </w:pPr>
+      <w:r>
+        <w:rPr>
+          <w:rFonts w:ascii="Arial" w:hAnsi="Arial"/>
+          <w:b/>
+          <w:color w:val="4F5964"/>
+          <w:sz w:val="19"/>
+        </w:rPr>
+        <w:t>EXPERIENCE</w:t>
+      </w:r>
+    </w:p>
+    <w:p>
+      <w:pPr>
+        <w:spacing w:before="100" w:after="20" w:line="240" w:lineRule="auto"/>
+      </w:pPr>
+      <w:r>
+        <w:rPr>
+          <w:rFonts w:ascii="Arial" w:hAnsi="Arial"/>
+          <w:b/>
+          <w:color w:val="171C22"/>
+          <w:sz w:val="22"/>
+        </w:rPr>
+        <w:t>Esports League Development Volunteer</w:t>
       </w:r>
     </w:p>
     <w:p>
@@ -70,49 +107,11 @@
         <w:spacing w:before="0" w:after="60" w:line="240" w:lineRule="auto"/>
       </w:pPr>
       <w:r>
-        <w:t>Entertainment business professional with 8+ years of experience across community management, esports operations, customer service, and technical support. Managed a 15,921-member Discord community, increased engagement by 35%, and developed sponsorship and operations materials for a sports marketing agency's esports division.</w:t>
-      </w:r>
-    </w:p>
-    <w:p>
-      <w:pPr>
-        <w:spacing w:before="200" w:after="80" w:line="240" w:lineRule="auto"/>
-        <w:pBdr>
-          <w:bottom w:val="single" w:sz="8" w:space="1" w:color="D9DDE3"/>
-        </w:pBdr>
-      </w:pPr>
-      <w:r>
-        <w:rPr>
-          <w:rFonts w:ascii="Arial" w:hAnsi="Arial"/>
-          <w:b/>
-          <w:color w:val="374655"/>
-          <w:sz w:val="20"/>
-        </w:rPr>
-        <w:t>EXPERIENCE</w:t>
-      </w:r>
-    </w:p>
-    <w:p>
-      <w:pPr>
-        <w:spacing w:before="80" w:after="20" w:line="240" w:lineRule="auto"/>
-      </w:pPr>
-      <w:r>
-        <w:rPr>
-          <w:rFonts w:ascii="Arial" w:hAnsi="Arial"/>
-          <w:b/>
-          <w:sz w:val="22"/>
-        </w:rPr>
-        <w:t>Esports League Development Volunteer</w:t>
-      </w:r>
-    </w:p>
-    <w:p>
-      <w:pPr>
-        <w:spacing w:before="0" w:after="40" w:line="240" w:lineRule="auto"/>
-      </w:pPr>
-      <w:r>
         <w:rPr>
           <w:rFonts w:ascii="Arial" w:hAnsi="Arial"/>
           <w:i/>
-          <w:color w:val="5F6B76"/>
-          <w:sz w:val="19"/>
+          <w:color w:val="707983"/>
+          <w:sz w:val="17"/>
         </w:rPr>
         <w:t>Sports Media Inc. · Los Angeles, CA (Remote) · June 2025 – May 2026</w:t>
       </w:r>
@@ -120,8 +119,8 @@
     <w:p>
       <w:pPr>
         <w:pStyle w:val="ListBullet"/>
-        <w:spacing w:before="0" w:after="20" w:line="252" w:lineRule="auto"/>
-        <w:ind w:left="360" w:hanging="216"/>
+        <w:spacing w:before="0" w:after="40" w:line="259" w:lineRule="auto"/>
+        <w:ind w:left="317" w:hanging="202"/>
       </w:pPr>
       <w:r>
         <w:t>Developed sponsorship proposals and supporting documentation for the esports division of a sports marketing agency with 780+ venue partnerships.</w:t>
@@ -130,8 +129,8 @@
     <w:p>
       <w:pPr>
         <w:pStyle w:val="ListBullet"/>
-        <w:spacing w:before="0" w:after="20" w:line="252" w:lineRule="auto"/>
-        <w:ind w:left="360" w:hanging="216"/>
+        <w:spacing w:before="0" w:after="40" w:line="259" w:lineRule="auto"/>
+        <w:ind w:left="317" w:hanging="202"/>
       </w:pPr>
       <w:r>
         <w:t>Collaborated with legal and content teams to align partnership materials with brand standards and internal review requirements.</w:t>
@@ -140,8 +139,8 @@
     <w:p>
       <w:pPr>
         <w:pStyle w:val="ListBullet"/>
-        <w:spacing w:before="0" w:after="20" w:line="252" w:lineRule="auto"/>
-        <w:ind w:left="360" w:hanging="216"/>
+        <w:spacing w:before="0" w:after="40" w:line="259" w:lineRule="auto"/>
+        <w:ind w:left="317" w:hanging="202"/>
       </w:pPr>
       <w:r>
         <w:t>Organized tournament operations, including scheduling, registration tracking, and ruleset documentation for competitive gaming programs.</w:t>
@@ -150,8 +149,8 @@
     <w:p>
       <w:pPr>
         <w:pStyle w:val="ListBullet"/>
-        <w:spacing w:before="0" w:after="20" w:line="252" w:lineRule="auto"/>
-        <w:ind w:left="360" w:hanging="216"/>
+        <w:spacing w:before="0" w:after="40" w:line="259" w:lineRule="auto"/>
+        <w:ind w:left="317" w:hanging="202"/>
       </w:pPr>
       <w:r>
         <w:t>Managed shared workflows and cross-department communication using Google Drive, Slack, and AI-assisted productivity tools.</w:t>
@@ -159,12 +158,13 @@
     </w:p>
     <w:p>
       <w:pPr>
-        <w:spacing w:before="80" w:after="20" w:line="240" w:lineRule="auto"/>
+        <w:spacing w:before="100" w:after="20" w:line="240" w:lineRule="auto"/>
       </w:pPr>
       <w:r>
         <w:rPr>
           <w:rFonts w:ascii="Arial" w:hAnsi="Arial"/>
           <w:b/>
+          <w:color w:val="171C22"/>
           <w:sz w:val="22"/>
         </w:rPr>
         <w:t>Discord &amp; Community Manager</w:t>
@@ -172,14 +172,14 @@
     </w:p>
     <w:p>
       <w:pPr>
-        <w:spacing w:before="0" w:after="40" w:line="240" w:lineRule="auto"/>
+        <w:spacing w:before="0" w:after="60" w:line="240" w:lineRule="auto"/>
       </w:pPr>
       <w:r>
         <w:rPr>
           <w:rFonts w:ascii="Arial" w:hAnsi="Arial"/>
           <w:i/>
-          <w:color w:val="5F6B76"/>
-          <w:sz w:val="19"/>
+          <w:color w:val="707983"/>
+          <w:sz w:val="17"/>
         </w:rPr>
         <w:t>Tanbii · Los Angeles, CA (Remote) · February 2025 – June 2025</w:t>
       </w:r>
@@ -187,8 +187,8 @@
     <w:p>
       <w:pPr>
         <w:pStyle w:val="ListBullet"/>
-        <w:spacing w:before="0" w:after="20" w:line="252" w:lineRule="auto"/>
-        <w:ind w:left="360" w:hanging="216"/>
+        <w:spacing w:before="0" w:after="40" w:line="259" w:lineRule="auto"/>
+        <w:ind w:left="317" w:hanging="202"/>
       </w:pPr>
       <w:r>
         <w:t>Managed and grew a Discord community of 15,921 members, increasing engagement by 35% through events, contests, and Q&amp;A campaigns.</w:t>
@@ -197,8 +197,8 @@
     <w:p>
       <w:pPr>
         <w:pStyle w:val="ListBullet"/>
-        <w:spacing w:before="0" w:after="20" w:line="252" w:lineRule="auto"/>
-        <w:ind w:left="360" w:hanging="216"/>
+        <w:spacing w:before="0" w:after="40" w:line="259" w:lineRule="auto"/>
+        <w:ind w:left="317" w:hanging="202"/>
       </w:pPr>
       <w:r>
         <w:t>Designed and launched the Tanbii Internship Challenge, a four-category competition that added 532 members over six months.</w:t>
@@ -207,8 +207,8 @@
     <w:p>
       <w:pPr>
         <w:pStyle w:val="ListBullet"/>
-        <w:spacing w:before="0" w:after="20" w:line="252" w:lineRule="auto"/>
-        <w:ind w:left="360" w:hanging="216"/>
+        <w:spacing w:before="0" w:after="40" w:line="259" w:lineRule="auto"/>
+        <w:ind w:left="317" w:hanging="202"/>
       </w:pPr>
       <w:r>
         <w:t>Maintained a cross-platform content calendar across Instagram, TikTok, Facebook, and X in coordination with marketing initiatives.</w:t>
@@ -217,8 +217,8 @@
     <w:p>
       <w:pPr>
         <w:pStyle w:val="ListBullet"/>
-        <w:spacing w:before="0" w:after="20" w:line="252" w:lineRule="auto"/>
-        <w:ind w:left="360" w:hanging="216"/>
+        <w:spacing w:before="0" w:after="40" w:line="259" w:lineRule="auto"/>
+        <w:ind w:left="317" w:hanging="202"/>
       </w:pPr>
       <w:r>
         <w:t>Built moderation workflows and automation systems with MEE6 and Dyno to support community health at scale.</w:t>
@@ -227,8 +227,8 @@
     <w:p>
       <w:pPr>
         <w:pStyle w:val="ListBullet"/>
-        <w:spacing w:before="0" w:after="20" w:line="252" w:lineRule="auto"/>
-        <w:ind w:left="360" w:hanging="216"/>
+        <w:spacing w:before="0" w:after="40" w:line="259" w:lineRule="auto"/>
+        <w:ind w:left="317" w:hanging="202"/>
       </w:pPr>
       <w:r>
         <w:t>Reported audience feedback and behavior trends to product and marketing stakeholders to inform decisions.</w:t>
@@ -236,12 +236,13 @@
     </w:p>
     <w:p>
       <w:pPr>
-        <w:spacing w:before="80" w:after="20" w:line="240" w:lineRule="auto"/>
+        <w:spacing w:before="100" w:after="20" w:line="240" w:lineRule="auto"/>
       </w:pPr>
       <w:r>
         <w:rPr>
           <w:rFonts w:ascii="Arial" w:hAnsi="Arial"/>
           <w:b/>
+          <w:color w:val="171C22"/>
           <w:sz w:val="22"/>
         </w:rPr>
         <w:t>Customer Service Representative II</w:t>
@@ -249,14 +250,14 @@
     </w:p>
     <w:p>
       <w:pPr>
-        <w:spacing w:before="0" w:after="40" w:line="240" w:lineRule="auto"/>
+        <w:spacing w:before="0" w:after="60" w:line="240" w:lineRule="auto"/>
       </w:pPr>
       <w:r>
         <w:rPr>
           <w:rFonts w:ascii="Arial" w:hAnsi="Arial"/>
           <w:i/>
-          <w:color w:val="5F6B76"/>
-          <w:sz w:val="19"/>
+          <w:color w:val="707983"/>
+          <w:sz w:val="17"/>
         </w:rPr>
         <w:t>Optum / UnitedHealth Group · Remote · February 2023 – September 2024</w:t>
       </w:r>
@@ -264,8 +265,8 @@
     <w:p>
       <w:pPr>
         <w:pStyle w:val="ListBullet"/>
-        <w:spacing w:before="0" w:after="20" w:line="252" w:lineRule="auto"/>
-        <w:ind w:left="360" w:hanging="216"/>
+        <w:spacing w:before="0" w:after="40" w:line="259" w:lineRule="auto"/>
+        <w:ind w:left="317" w:hanging="202"/>
       </w:pPr>
       <w:r>
         <w:t>Handled 50+ inbound calls daily, authorizing treatment for mental health and substance abuse cases across multiple levels of care.</w:t>
@@ -274,8 +275,8 @@
     <w:p>
       <w:pPr>
         <w:pStyle w:val="ListBullet"/>
-        <w:spacing w:before="0" w:after="20" w:line="252" w:lineRule="auto"/>
-        <w:ind w:left="360" w:hanging="216"/>
+        <w:spacing w:before="0" w:after="40" w:line="259" w:lineRule="auto"/>
+        <w:ind w:left="317" w:hanging="202"/>
       </w:pPr>
       <w:r>
         <w:t>Managed an active member caseload, ensuring care met medical necessity guidelines and connecting members with crisis and support resources.</w:t>
@@ -284,8 +285,8 @@
     <w:p>
       <w:pPr>
         <w:pStyle w:val="ListBullet"/>
-        <w:spacing w:before="0" w:after="20" w:line="252" w:lineRule="auto"/>
-        <w:ind w:left="360" w:hanging="216"/>
+        <w:spacing w:before="0" w:after="40" w:line="259" w:lineRule="auto"/>
+        <w:ind w:left="317" w:hanging="202"/>
       </w:pPr>
       <w:r>
         <w:t>Resolved escalated issues across multiple systems, including iSETT, CDB, and LINX, in partnership with clinical and support teams.</w:t>
@@ -293,12 +294,13 @@
     </w:p>
     <w:p>
       <w:pPr>
-        <w:spacing w:before="80" w:after="20" w:line="240" w:lineRule="auto"/>
+        <w:spacing w:before="100" w:after="20" w:line="240" w:lineRule="auto"/>
       </w:pPr>
       <w:r>
         <w:rPr>
           <w:rFonts w:ascii="Arial" w:hAnsi="Arial"/>
           <w:b/>
+          <w:color w:val="171C22"/>
           <w:sz w:val="22"/>
         </w:rPr>
         <w:t>Sr. Benefit Audit Agent / Sr. Customer Service Representative</w:t>
@@ -306,14 +308,14 @@
     </w:p>
     <w:p>
       <w:pPr>
-        <w:spacing w:before="0" w:after="40" w:line="240" w:lineRule="auto"/>
+        <w:spacing w:before="0" w:after="60" w:line="240" w:lineRule="auto"/>
       </w:pPr>
       <w:r>
         <w:rPr>
           <w:rFonts w:ascii="Arial" w:hAnsi="Arial"/>
           <w:i/>
-          <w:color w:val="5F6B76"/>
-          <w:sz w:val="19"/>
+          <w:color w:val="707983"/>
+          <w:sz w:val="17"/>
         </w:rPr>
         <w:t>Aerotek (Contract for Maximus) · Remote / Fontana, CA · January 2022 – January 2023</w:t>
       </w:r>
@@ -321,8 +323,8 @@
     <w:p>
       <w:pPr>
         <w:pStyle w:val="ListBullet"/>
-        <w:spacing w:before="0" w:after="20" w:line="252" w:lineRule="auto"/>
-        <w:ind w:left="360" w:hanging="216"/>
+        <w:spacing w:before="0" w:after="40" w:line="259" w:lineRule="auto"/>
+        <w:ind w:left="317" w:hanging="202"/>
       </w:pPr>
       <w:r>
         <w:t>Reviewed unemployment insurance claims against policy and UI code requirements to identify discrepancies across a high-volume caseload.</w:t>
@@ -331,8 +333,8 @@
     <w:p>
       <w:pPr>
         <w:pStyle w:val="ListBullet"/>
-        <w:spacing w:before="0" w:after="20" w:line="252" w:lineRule="auto"/>
-        <w:ind w:left="360" w:hanging="216"/>
+        <w:spacing w:before="0" w:after="40" w:line="259" w:lineRule="auto"/>
+        <w:ind w:left="317" w:hanging="202"/>
       </w:pPr>
       <w:r>
         <w:t>Resolved complex wage and benefit cross-matching issues while coordinating with subject matter experts on escalations.</w:t>
@@ -341,8 +343,8 @@
     <w:p>
       <w:pPr>
         <w:pStyle w:val="ListBullet"/>
-        <w:spacing w:before="0" w:after="20" w:line="252" w:lineRule="auto"/>
-        <w:ind w:left="360" w:hanging="216"/>
+        <w:spacing w:before="0" w:after="40" w:line="259" w:lineRule="auto"/>
+        <w:ind w:left="317" w:hanging="202"/>
       </w:pPr>
       <w:r>
         <w:t>Trained and mentored junior team members on audit workflows, documentation quality, and case handling practices.</w:t>
@@ -350,12 +352,13 @@
     </w:p>
     <w:p>
       <w:pPr>
-        <w:spacing w:before="80" w:after="20" w:line="240" w:lineRule="auto"/>
+        <w:spacing w:before="100" w:after="20" w:line="240" w:lineRule="auto"/>
       </w:pPr>
       <w:r>
         <w:rPr>
           <w:rFonts w:ascii="Arial" w:hAnsi="Arial"/>
           <w:b/>
+          <w:color w:val="171C22"/>
           <w:sz w:val="22"/>
         </w:rPr>
         <w:t>Overnight Family Liaison &amp; Logistics Specialist</w:t>
@@ -363,14 +366,14 @@
     </w:p>
     <w:p>
       <w:pPr>
-        <w:spacing w:before="0" w:after="40" w:line="240" w:lineRule="auto"/>
+        <w:spacing w:before="0" w:after="60" w:line="240" w:lineRule="auto"/>
       </w:pPr>
       <w:r>
         <w:rPr>
           <w:rFonts w:ascii="Arial" w:hAnsi="Arial"/>
           <w:i/>
-          <w:color w:val="5F6B76"/>
-          <w:sz w:val="19"/>
+          <w:color w:val="707983"/>
+          <w:sz w:val="17"/>
         </w:rPr>
         <w:t>Team Hope (Cherokee Federal / HHS Emergency Intake Site) · Pomona, CA · May 2021 – November 2021</w:t>
       </w:r>
@@ -378,8 +381,8 @@
     <w:p>
       <w:pPr>
         <w:pStyle w:val="ListBullet"/>
-        <w:spacing w:before="0" w:after="20" w:line="252" w:lineRule="auto"/>
-        <w:ind w:left="360" w:hanging="216"/>
+        <w:spacing w:before="0" w:after="40" w:line="259" w:lineRule="auto"/>
+        <w:ind w:left="317" w:hanging="202"/>
       </w:pPr>
       <w:r>
         <w:t>Supported secure family communication for unaccompanied youth while maintaining privacy expectations and HHS compliance.</w:t>
@@ -388,8 +391,8 @@
     <w:p>
       <w:pPr>
         <w:pStyle w:val="ListBullet"/>
-        <w:spacing w:before="0" w:after="20" w:line="252" w:lineRule="auto"/>
-        <w:ind w:left="360" w:hanging="216"/>
+        <w:spacing w:before="0" w:after="40" w:line="259" w:lineRule="auto"/>
+        <w:ind w:left="317" w:hanging="202"/>
       </w:pPr>
       <w:r>
         <w:t>Coordinated overnight distribution of emergency supplies, helping ensure children received required clothing, bedding, and care items.</w:t>
@@ -398,8 +401,8 @@
     <w:p>
       <w:pPr>
         <w:pStyle w:val="ListBullet"/>
-        <w:spacing w:before="0" w:after="20" w:line="252" w:lineRule="auto"/>
-        <w:ind w:left="360" w:hanging="216"/>
+        <w:spacing w:before="0" w:after="40" w:line="259" w:lineRule="auto"/>
+        <w:ind w:left="317" w:hanging="202"/>
       </w:pPr>
       <w:r>
         <w:t>Provided calm, trauma-informed support during overnight operations in a high-pressure humanitarian response environment.</w:t>
@@ -407,12 +410,13 @@
     </w:p>
     <w:p>
       <w:pPr>
-        <w:spacing w:before="80" w:after="20" w:line="240" w:lineRule="auto"/>
+        <w:spacing w:before="100" w:after="20" w:line="240" w:lineRule="auto"/>
       </w:pPr>
       <w:r>
         <w:rPr>
           <w:rFonts w:ascii="Arial" w:hAnsi="Arial"/>
           <w:b/>
+          <w:color w:val="171C22"/>
           <w:sz w:val="22"/>
         </w:rPr>
         <w:t>Patient Service Representative</w:t>
@@ -420,14 +424,14 @@
     </w:p>
     <w:p>
       <w:pPr>
-        <w:spacing w:before="0" w:after="40" w:line="240" w:lineRule="auto"/>
+        <w:spacing w:before="0" w:after="60" w:line="240" w:lineRule="auto"/>
       </w:pPr>
       <w:r>
         <w:rPr>
           <w:rFonts w:ascii="Arial" w:hAnsi="Arial"/>
           <w:i/>
-          <w:color w:val="5F6B76"/>
-          <w:sz w:val="19"/>
+          <w:color w:val="707983"/>
+          <w:sz w:val="17"/>
         </w:rPr>
         <w:t>Kaiser Permanente · Fontana, CA · January 2021 – September 2021</w:t>
       </w:r>
@@ -435,8 +439,8 @@
     <w:p>
       <w:pPr>
         <w:pStyle w:val="ListBullet"/>
-        <w:spacing w:before="0" w:after="20" w:line="252" w:lineRule="auto"/>
-        <w:ind w:left="360" w:hanging="216"/>
+        <w:spacing w:before="0" w:after="40" w:line="259" w:lineRule="auto"/>
+        <w:ind w:left="317" w:hanging="202"/>
       </w:pPr>
       <w:r>
         <w:t>Verified patient information, processed payments, and assisted with history, consent, and account inquiries in a high-traffic medical setting.</w:t>
@@ -444,12 +448,13 @@
     </w:p>
     <w:p>
       <w:pPr>
-        <w:spacing w:before="80" w:after="20" w:line="240" w:lineRule="auto"/>
+        <w:spacing w:before="100" w:after="20" w:line="240" w:lineRule="auto"/>
       </w:pPr>
       <w:r>
         <w:rPr>
           <w:rFonts w:ascii="Arial" w:hAnsi="Arial"/>
           <w:b/>
+          <w:color w:val="171C22"/>
           <w:sz w:val="22"/>
         </w:rPr>
         <w:t>Call Center Representative</w:t>
@@ -457,14 +462,14 @@
     </w:p>
     <w:p>
       <w:pPr>
-        <w:spacing w:before="0" w:after="40" w:line="240" w:lineRule="auto"/>
+        <w:spacing w:before="0" w:after="60" w:line="240" w:lineRule="auto"/>
       </w:pPr>
       <w:r>
         <w:rPr>
           <w:rFonts w:ascii="Arial" w:hAnsi="Arial"/>
           <w:i/>
-          <w:color w:val="5F6B76"/>
-          <w:sz w:val="19"/>
+          <w:color w:val="707983"/>
+          <w:sz w:val="17"/>
         </w:rPr>
         <w:t>American Security Products (AMSEC) · Fontana, CA · May 2019 – October 2020</w:t>
       </w:r>
@@ -472,8 +477,8 @@
     <w:p>
       <w:pPr>
         <w:pStyle w:val="ListBullet"/>
-        <w:spacing w:before="0" w:after="20" w:line="252" w:lineRule="auto"/>
-        <w:ind w:left="360" w:hanging="216"/>
+        <w:spacing w:before="0" w:after="40" w:line="259" w:lineRule="auto"/>
+        <w:ind w:left="317" w:hanging="202"/>
       </w:pPr>
       <w:r>
         <w:t>Diagnosed mechanical and electronic lock issues through inbound support calls and coordinated locksmith scheduling.</w:t>
@@ -482,8 +487,8 @@
     <w:p>
       <w:pPr>
         <w:pStyle w:val="ListBullet"/>
-        <w:spacing w:before="0" w:after="20" w:line="252" w:lineRule="auto"/>
-        <w:ind w:left="360" w:hanging="216"/>
+        <w:spacing w:before="0" w:after="40" w:line="259" w:lineRule="auto"/>
+        <w:ind w:left="317" w:hanging="202"/>
       </w:pPr>
       <w:r>
         <w:t>Logged service activity in SafeManager and trained new hires on customer service procedures and documentation practices.</w:t>
@@ -491,12 +496,13 @@
     </w:p>
     <w:p>
       <w:pPr>
-        <w:spacing w:before="80" w:after="20" w:line="240" w:lineRule="auto"/>
+        <w:spacing w:before="100" w:after="20" w:line="240" w:lineRule="auto"/>
       </w:pPr>
       <w:r>
         <w:rPr>
           <w:rFonts w:ascii="Arial" w:hAnsi="Arial"/>
           <w:b/>
+          <w:color w:val="171C22"/>
           <w:sz w:val="22"/>
         </w:rPr>
         <w:t>Network Technician</w:t>
@@ -504,14 +510,14 @@
     </w:p>
     <w:p>
       <w:pPr>
-        <w:spacing w:before="0" w:after="40" w:line="240" w:lineRule="auto"/>
+        <w:spacing w:before="0" w:after="60" w:line="240" w:lineRule="auto"/>
       </w:pPr>
       <w:r>
         <w:rPr>
           <w:rFonts w:ascii="Arial" w:hAnsi="Arial"/>
           <w:i/>
-          <w:color w:val="5F6B76"/>
-          <w:sz w:val="19"/>
+          <w:color w:val="707983"/>
+          <w:sz w:val="17"/>
         </w:rPr>
         <w:t>Charter Communications · Ontario, CA · February 2018 – April 2019</w:t>
       </w:r>
@@ -519,8 +525,8 @@
     <w:p>
       <w:pPr>
         <w:pStyle w:val="ListBullet"/>
-        <w:spacing w:before="0" w:after="20" w:line="252" w:lineRule="auto"/>
-        <w:ind w:left="360" w:hanging="216"/>
+        <w:spacing w:before="0" w:after="40" w:line="259" w:lineRule="auto"/>
+        <w:ind w:left="317" w:hanging="202"/>
       </w:pPr>
       <w:r>
         <w:t>Restored business and residential network service by troubleshooting LAN issues, hardware failures, and software configuration problems.</w:t>
@@ -528,12 +534,13 @@
     </w:p>
     <w:p>
       <w:pPr>
-        <w:spacing w:before="80" w:after="20" w:line="240" w:lineRule="auto"/>
+        <w:spacing w:before="100" w:after="20" w:line="240" w:lineRule="auto"/>
       </w:pPr>
       <w:r>
         <w:rPr>
           <w:rFonts w:ascii="Arial" w:hAnsi="Arial"/>
           <w:b/>
+          <w:color w:val="171C22"/>
           <w:sz w:val="22"/>
         </w:rPr>
         <w:t>Call Center Representative</w:t>
@@ -541,14 +548,14 @@
     </w:p>
     <w:p>
       <w:pPr>
-        <w:spacing w:before="0" w:after="40" w:line="240" w:lineRule="auto"/>
+        <w:spacing w:before="0" w:after="60" w:line="240" w:lineRule="auto"/>
       </w:pPr>
       <w:r>
         <w:rPr>
           <w:rFonts w:ascii="Arial" w:hAnsi="Arial"/>
           <w:i/>
-          <w:color w:val="5F6B76"/>
-          <w:sz w:val="19"/>
+          <w:color w:val="707983"/>
+          <w:sz w:val="17"/>
         </w:rPr>
         <w:t>Wells Fargo · San Bernardino, CA · August 2016 – January 2018</w:t>
       </w:r>
@@ -556,8 +563,8 @@
     <w:p>
       <w:pPr>
         <w:pStyle w:val="ListBullet"/>
-        <w:spacing w:before="0" w:after="20" w:line="252" w:lineRule="auto"/>
-        <w:ind w:left="360" w:hanging="216"/>
+        <w:spacing w:before="0" w:after="40" w:line="259" w:lineRule="auto"/>
+        <w:ind w:left="317" w:hanging="202"/>
       </w:pPr>
       <w:r>
         <w:t>Assisted customers with account, billing, and service questions while de-escalating concerns and supporting new-hire training.</w:t>
@@ -565,29 +572,30 @@
     </w:p>
     <w:p>
       <w:pPr>
-        <w:spacing w:before="200" w:after="80" w:line="240" w:lineRule="auto"/>
+        <w:spacing w:before="240" w:after="100" w:line="240" w:lineRule="auto"/>
         <w:pBdr>
-          <w:bottom w:val="single" w:sz="8" w:space="1" w:color="D9DDE3"/>
+          <w:bottom w:val="single" w:sz="6" w:space="1" w:color="D4D9DF"/>
         </w:pBdr>
       </w:pPr>
       <w:r>
         <w:rPr>
           <w:rFonts w:ascii="Arial" w:hAnsi="Arial"/>
           <w:b/>
-          <w:color w:val="374655"/>
-          <w:sz w:val="20"/>
+          <w:color w:val="4F5964"/>
+          <w:sz w:val="19"/>
         </w:rPr>
         <w:t>PROJECTS</w:t>
       </w:r>
     </w:p>
     <w:p>
       <w:pPr>
-        <w:spacing w:before="80" w:after="20" w:line="240" w:lineRule="auto"/>
+        <w:spacing w:before="100" w:after="20" w:line="240" w:lineRule="auto"/>
       </w:pPr>
       <w:r>
         <w:rPr>
           <w:rFonts w:ascii="Arial" w:hAnsi="Arial"/>
           <w:b/>
+          <w:color w:val="171C22"/>
           <w:sz w:val="22"/>
         </w:rPr>
         <w:t>Tempest eSports — Brand Strategy</w:t>
@@ -595,14 +603,14 @@
     </w:p>
     <w:p>
       <w:pPr>
-        <w:spacing w:before="0" w:after="40" w:line="240" w:lineRule="auto"/>
+        <w:spacing w:before="0" w:after="60" w:line="240" w:lineRule="auto"/>
       </w:pPr>
       <w:r>
         <w:rPr>
           <w:rFonts w:ascii="Arial" w:hAnsi="Arial"/>
           <w:i/>
-          <w:color w:val="5F6B76"/>
-          <w:sz w:val="19"/>
+          <w:color w:val="707983"/>
+          <w:sz w:val="17"/>
         </w:rPr>
         <w:t>Full Sail University · 2025 – Present</w:t>
       </w:r>
@@ -610,8 +618,8 @@
     <w:p>
       <w:pPr>
         <w:pStyle w:val="ListBullet"/>
-        <w:spacing w:before="0" w:after="20" w:line="252" w:lineRule="auto"/>
-        <w:ind w:left="360" w:hanging="216"/>
+        <w:spacing w:before="0" w:after="40" w:line="259" w:lineRule="auto"/>
+        <w:ind w:left="317" w:hanging="202"/>
       </w:pPr>
       <w:r>
         <w:t>Built a digital marketing strategy for an FPS-focused esports organization targeting Call of Duty, Valorant, Apex Legends, and Counter-Strike audiences.</w:t>
@@ -620,8 +628,8 @@
     <w:p>
       <w:pPr>
         <w:pStyle w:val="ListBullet"/>
-        <w:spacing w:before="0" w:after="20" w:line="252" w:lineRule="auto"/>
-        <w:ind w:left="360" w:hanging="216"/>
+        <w:spacing w:before="0" w:after="40" w:line="259" w:lineRule="auto"/>
+        <w:ind w:left="317" w:hanging="202"/>
       </w:pPr>
       <w:r>
         <w:t>Conducted competitive analysis of 100 Thieves, FaZe Clan, and Team Liquid and translated findings into positioning and content recommendations.</w:t>
@@ -630,8 +638,8 @@
     <w:p>
       <w:pPr>
         <w:pStyle w:val="ListBullet"/>
-        <w:spacing w:before="0" w:after="20" w:line="252" w:lineRule="auto"/>
-        <w:ind w:left="360" w:hanging="216"/>
+        <w:spacing w:before="0" w:after="40" w:line="259" w:lineRule="auto"/>
+        <w:ind w:left="317" w:hanging="202"/>
       </w:pPr>
       <w:r>
         <w:t>Designed a $15,000 Year 1 campaign budget with projected $162,000 revenue and KPI targets for growth and traffic.</w:t>
@@ -639,29 +647,30 @@
     </w:p>
     <w:p>
       <w:pPr>
-        <w:spacing w:before="200" w:after="80" w:line="240" w:lineRule="auto"/>
+        <w:spacing w:before="240" w:after="100" w:line="240" w:lineRule="auto"/>
         <w:pBdr>
-          <w:bottom w:val="single" w:sz="8" w:space="1" w:color="D9DDE3"/>
+          <w:bottom w:val="single" w:sz="6" w:space="1" w:color="D4D9DF"/>
         </w:pBdr>
       </w:pPr>
       <w:r>
         <w:rPr>
           <w:rFonts w:ascii="Arial" w:hAnsi="Arial"/>
           <w:b/>
-          <w:color w:val="374655"/>
-          <w:sz w:val="20"/>
+          <w:color w:val="4F5964"/>
+          <w:sz w:val="19"/>
         </w:rPr>
         <w:t>EDUCATION</w:t>
       </w:r>
     </w:p>
     <w:p>
       <w:pPr>
-        <w:spacing w:before="80" w:after="20" w:line="240" w:lineRule="auto"/>
+        <w:spacing w:before="100" w:after="20" w:line="240" w:lineRule="auto"/>
       </w:pPr>
       <w:r>
         <w:rPr>
           <w:rFonts w:ascii="Arial" w:hAnsi="Arial"/>
           <w:b/>
+          <w:color w:val="171C22"/>
           <w:sz w:val="22"/>
         </w:rPr>
         <w:t>Master of Science, Entertainment Business</w:t>
@@ -669,26 +678,27 @@
     </w:p>
     <w:p>
       <w:pPr>
-        <w:spacing w:before="0" w:after="40" w:line="240" w:lineRule="auto"/>
+        <w:spacing w:before="0" w:after="60" w:line="240" w:lineRule="auto"/>
       </w:pPr>
       <w:r>
         <w:rPr>
           <w:rFonts w:ascii="Arial" w:hAnsi="Arial"/>
           <w:i/>
-          <w:color w:val="5F6B76"/>
-          <w:sz w:val="19"/>
+          <w:color w:val="707983"/>
+          <w:sz w:val="17"/>
         </w:rPr>
         <w:t>Full Sail University · September 2025 – Expected 2027</w:t>
       </w:r>
     </w:p>
     <w:p>
       <w:pPr>
-        <w:spacing w:before="80" w:after="20" w:line="240" w:lineRule="auto"/>
+        <w:spacing w:before="100" w:after="20" w:line="240" w:lineRule="auto"/>
       </w:pPr>
       <w:r>
         <w:rPr>
           <w:rFonts w:ascii="Arial" w:hAnsi="Arial"/>
           <w:b/>
+          <w:color w:val="171C22"/>
           <w:sz w:val="22"/>
         </w:rPr>
         <w:t>Bachelor of Science, Esports Management, Production and Performance</w:t>
@@ -696,38 +706,38 @@
     </w:p>
     <w:p>
       <w:pPr>
-        <w:spacing w:before="0" w:after="40" w:line="240" w:lineRule="auto"/>
+        <w:spacing w:before="0" w:after="60" w:line="240" w:lineRule="auto"/>
       </w:pPr>
       <w:r>
         <w:rPr>
           <w:rFonts w:ascii="Arial" w:hAnsi="Arial"/>
           <w:i/>
-          <w:color w:val="5F6B76"/>
-          <w:sz w:val="19"/>
+          <w:color w:val="707983"/>
+          <w:sz w:val="17"/>
         </w:rPr>
         <w:t>Harrisburg University of Science and Technology · August 2022 – August 2025</w:t>
       </w:r>
     </w:p>
     <w:p>
       <w:pPr>
-        <w:spacing w:before="200" w:after="80" w:line="240" w:lineRule="auto"/>
+        <w:spacing w:before="240" w:after="100" w:line="240" w:lineRule="auto"/>
         <w:pBdr>
-          <w:bottom w:val="single" w:sz="8" w:space="1" w:color="D9DDE3"/>
+          <w:bottom w:val="single" w:sz="6" w:space="1" w:color="D4D9DF"/>
         </w:pBdr>
       </w:pPr>
       <w:r>
         <w:rPr>
           <w:rFonts w:ascii="Arial" w:hAnsi="Arial"/>
           <w:b/>
-          <w:color w:val="374655"/>
-          <w:sz w:val="20"/>
+          <w:color w:val="4F5964"/>
+          <w:sz w:val="19"/>
         </w:rPr>
         <w:t>CERTIFICATIONS</w:t>
       </w:r>
     </w:p>
     <w:p>
       <w:pPr>
-        <w:spacing w:before="0" w:after="60" w:line="240" w:lineRule="auto"/>
+        <w:spacing w:before="0" w:after="80" w:line="259" w:lineRule="auto"/>
       </w:pPr>
       <w:r>
         <w:t>Platform Certifications</w:t>
@@ -735,7 +745,7 @@
     </w:p>
     <w:p>
       <w:pPr>
-        <w:spacing w:before="0" w:after="60" w:line="240" w:lineRule="auto"/>
+        <w:spacing w:before="0" w:after="80" w:line="259" w:lineRule="auto"/>
       </w:pPr>
       <w:r>
         <w:t>LinkedIn Marketing Labs Certification · HubSpot Social Media Marketing Certification</w:t>
@@ -743,7 +753,7 @@
     </w:p>
     <w:p>
       <w:pPr>
-        <w:spacing w:before="0" w:after="60" w:line="240" w:lineRule="auto"/>
+        <w:spacing w:before="0" w:after="80" w:line="259" w:lineRule="auto"/>
       </w:pPr>
       <w:r>
         <w:t>Marketing &amp; Digital</w:t>
@@ -751,15 +761,15 @@
     </w:p>
     <w:p>
       <w:pPr>
-        <w:spacing w:before="0" w:after="60" w:line="240" w:lineRule="auto"/>
+        <w:spacing w:before="0" w:after="80" w:line="259" w:lineRule="auto"/>
       </w:pPr>
       <w:r>
-        <w:t>Digital Marketing Foundations · Social Media Marketing Foundations · Content Marketing Foundations · SEO Foundations · Email and Newsletter Marketing Foundations · Marketing Foundations: Ecommerce</w:t>
+        <w:t>Digital Marketing Foundations · Social Media Marketing Foundations · Content Marketing Foundations · SEO Foundations</w:t>
       </w:r>
     </w:p>
     <w:p>
       <w:pPr>
-        <w:spacing w:before="0" w:after="60" w:line="240" w:lineRule="auto"/>
+        <w:spacing w:before="0" w:after="80" w:line="259" w:lineRule="auto"/>
       </w:pPr>
       <w:r>
         <w:t>Business Analysis &amp; Project Management</w:t>
@@ -767,15 +777,15 @@
     </w:p>
     <w:p>
       <w:pPr>
-        <w:spacing w:before="0" w:after="60" w:line="240" w:lineRule="auto"/>
+        <w:spacing w:before="0" w:after="80" w:line="259" w:lineRule="auto"/>
       </w:pPr>
       <w:r>
-        <w:t>Business Analysis Foundations · Business Process Modeling · Agile Requirements Foundations · Requirements Elicitation and Analysis · Project Management Foundations: Requirements</w:t>
+        <w:t>Business Analysis Foundations · Agile Requirements Foundations · Requirements Elicitation and Analysis</w:t>
       </w:r>
     </w:p>
     <w:p>
       <w:pPr>
-        <w:spacing w:before="0" w:after="60" w:line="240" w:lineRule="auto"/>
+        <w:spacing w:before="0" w:after="80" w:line="259" w:lineRule="auto"/>
       </w:pPr>
       <w:r>
         <w:t>Data &amp; Technology</w:t>
@@ -783,7 +793,7 @@
     </w:p>
     <w:p>
       <w:pPr>
-        <w:spacing w:before="0" w:after="60" w:line="240" w:lineRule="auto"/>
+        <w:spacing w:before="0" w:after="80" w:line="259" w:lineRule="auto"/>
       </w:pPr>
       <w:r>
         <w:t>Learning Data Science: Understanding the Basics · Managing Data with Microsoft 365 · Figma Essential Training: The Basics</w:t>
@@ -791,24 +801,24 @@
     </w:p>
     <w:p>
       <w:pPr>
-        <w:spacing w:before="200" w:after="80" w:line="240" w:lineRule="auto"/>
+        <w:spacing w:before="240" w:after="100" w:line="240" w:lineRule="auto"/>
         <w:pBdr>
-          <w:bottom w:val="single" w:sz="8" w:space="1" w:color="D9DDE3"/>
+          <w:bottom w:val="single" w:sz="6" w:space="1" w:color="D4D9DF"/>
         </w:pBdr>
       </w:pPr>
       <w:r>
         <w:rPr>
           <w:rFonts w:ascii="Arial" w:hAnsi="Arial"/>
           <w:b/>
-          <w:color w:val="374655"/>
-          <w:sz w:val="20"/>
+          <w:color w:val="4F5964"/>
+          <w:sz w:val="19"/>
         </w:rPr>
         <w:t>SKILLS</w:t>
       </w:r>
     </w:p>
     <w:p>
       <w:pPr>
-        <w:spacing w:before="0" w:after="60" w:line="240" w:lineRule="auto"/>
+        <w:spacing w:before="0" w:after="80" w:line="259" w:lineRule="auto"/>
       </w:pPr>
       <w:r>
         <w:t>Community &amp; Audience</w:t>
@@ -816,15 +826,15 @@
     </w:p>
     <w:p>
       <w:pPr>
-        <w:spacing w:before="0" w:after="60" w:line="240" w:lineRule="auto"/>
+        <w:spacing w:before="0" w:after="80" w:line="259" w:lineRule="auto"/>
       </w:pPr>
       <w:r>
-        <w:t>Community Management · Discord Operations · Fan Engagement · Community Events · Moderation Systems · Relationship Management</w:t>
+        <w:t>Community Management · Discord Operations · Fan Engagement · Community Events · Moderation Systems</w:t>
       </w:r>
     </w:p>
     <w:p>
       <w:pPr>
-        <w:spacing w:before="0" w:after="60" w:line="240" w:lineRule="auto"/>
+        <w:spacing w:before="0" w:after="80" w:line="259" w:lineRule="auto"/>
       </w:pPr>
       <w:r>
         <w:t>Content &amp; Marketing</w:t>
@@ -832,15 +842,15 @@
     </w:p>
     <w:p>
       <w:pPr>
-        <w:spacing w:before="0" w:after="60" w:line="240" w:lineRule="auto"/>
+        <w:spacing w:before="0" w:after="80" w:line="259" w:lineRule="auto"/>
       </w:pPr>
       <w:r>
-        <w:t>Content Strategy · Content Writing · Content Scheduling · Social Media Marketing · Growth Marketing · SEO · Brand Partnerships</w:t>
+        <w:t>Content Strategy · Content Writing · Content Scheduling · Social Media Marketing · Growth Marketing · SEO</w:t>
       </w:r>
     </w:p>
     <w:p>
       <w:pPr>
-        <w:spacing w:before="0" w:after="60" w:line="240" w:lineRule="auto"/>
+        <w:spacing w:before="0" w:after="80" w:line="259" w:lineRule="auto"/>
       </w:pPr>
       <w:r>
         <w:t>Esports &amp; Operations</w:t>
@@ -848,15 +858,15 @@
     </w:p>
     <w:p>
       <w:pPr>
-        <w:spacing w:before="0" w:after="60" w:line="240" w:lineRule="auto"/>
+        <w:spacing w:before="0" w:after="80" w:line="259" w:lineRule="auto"/>
       </w:pPr>
       <w:r>
-        <w:t>Tournament Operations · Sponsorship Development · Live Streaming · Workflow Coordination · Documentation</w:t>
+        <w:t>Tournament Operations · Sponsorship Development · Workflow Coordination · Documentation</w:t>
       </w:r>
     </w:p>
     <w:p>
       <w:pPr>
-        <w:spacing w:before="0" w:after="60" w:line="240" w:lineRule="auto"/>
+        <w:spacing w:before="0" w:after="80" w:line="259" w:lineRule="auto"/>
       </w:pPr>
       <w:r>
         <w:t>Analytics &amp; Support</w:t>
@@ -864,32 +874,32 @@
     </w:p>
     <w:p>
       <w:pPr>
-        <w:spacing w:before="0" w:after="60" w:line="240" w:lineRule="auto"/>
+        <w:spacing w:before="0" w:after="80" w:line="259" w:lineRule="auto"/>
       </w:pPr>
       <w:r>
-        <w:t>Data Analytics · Engagement Tracking · Project Management · Customer Service · De-escalation · Technical Troubleshooting</w:t>
+        <w:t>Engagement Tracking · Project Management · Customer Service · De-escalation · Technical Troubleshooting</w:t>
       </w:r>
     </w:p>
     <w:p>
       <w:pPr>
-        <w:spacing w:before="200" w:after="80" w:line="240" w:lineRule="auto"/>
+        <w:spacing w:before="240" w:after="100" w:line="240" w:lineRule="auto"/>
         <w:pBdr>
-          <w:bottom w:val="single" w:sz="8" w:space="1" w:color="D9DDE3"/>
+          <w:bottom w:val="single" w:sz="6" w:space="1" w:color="D4D9DF"/>
         </w:pBdr>
       </w:pPr>
       <w:r>
         <w:rPr>
           <w:rFonts w:ascii="Arial" w:hAnsi="Arial"/>
           <w:b/>
-          <w:color w:val="374655"/>
-          <w:sz w:val="20"/>
+          <w:color w:val="4F5964"/>
+          <w:sz w:val="19"/>
         </w:rPr>
         <w:t>TOOLS</w:t>
       </w:r>
     </w:p>
     <w:p>
       <w:pPr>
-        <w:spacing w:before="0" w:after="60" w:line="240" w:lineRule="auto"/>
+        <w:spacing w:before="0" w:after="80" w:line="259" w:lineRule="auto"/>
       </w:pPr>
       <w:r>
         <w:t>Discord · Slack · Notion · Hootsuite · Zoho Social · Later · Canva · MEE6 · Dyno · HubSpot · Microsoft 365 · Google Workspace · Figma · OBS · Zoom · Twitch · YouTube</w:t>
@@ -897,24 +907,24 @@
     </w:p>
     <w:p>
       <w:pPr>
-        <w:spacing w:before="200" w:after="80" w:line="240" w:lineRule="auto"/>
+        <w:spacing w:before="240" w:after="100" w:line="240" w:lineRule="auto"/>
         <w:pBdr>
-          <w:bottom w:val="single" w:sz="8" w:space="1" w:color="D9DDE3"/>
+          <w:bottom w:val="single" w:sz="6" w:space="1" w:color="D4D9DF"/>
         </w:pBdr>
       </w:pPr>
       <w:r>
         <w:rPr>
           <w:rFonts w:ascii="Arial" w:hAnsi="Arial"/>
           <w:b/>
-          <w:color w:val="374655"/>
-          <w:sz w:val="20"/>
+          <w:color w:val="4F5964"/>
+          <w:sz w:val="19"/>
         </w:rPr>
         <w:t>LANGUAGES</w:t>
       </w:r>
     </w:p>
     <w:p>
       <w:pPr>
-        <w:spacing w:before="0" w:after="60" w:line="240" w:lineRule="auto"/>
+        <w:spacing w:before="0" w:after="80" w:line="259" w:lineRule="auto"/>
       </w:pPr>
       <w:r>
         <w:t>English (Native) · Spanish (Bilingual)</w:t>
@@ -922,7 +932,7 @@
     </w:p>
     <w:sectPr>
       <w:pgSz w:w="12240" w:h="15840"/>
-      <w:pgMar w:top="720" w:right="720" w:bottom="720" w:left="720" w:header="360" w:footer="360" w:gutter="0"/>
+      <w:pgMar w:top="1008" w:right="1008" w:bottom="1008" w:left="1008" w:header="720" w:footer="720" w:gutter="0"/>
       <w:cols w:space="720"/>
       <w:docGrid w:linePitch="360"/>
     </w:sectPr>

</xml_diff>

<commit_message>
Restore two-column resume layout
</commit_message>
<xml_diff>
--- a/docs/Reference/Marco_Morfin_Resume.docx
+++ b/docs/Reference/Marco_Morfin_Resume.docx
@@ -4,481 +4,835 @@
   <w:body>
     <w:p>
       <w:pPr>
-        <w:spacing w:before="0" w:after="40" w:line="240" w:lineRule="auto"/>
-        <w:jc w:val="left"/>
+        <w:spacing w:after="40"/>
       </w:pPr>
       <w:r>
         <w:rPr>
-          <w:rFonts w:ascii="Arial" w:hAnsi="Arial"/>
           <w:b/>
-          <w:color w:val="14181D"/>
-          <w:sz w:val="50"/>
+          <w:color w:val="161B21"/>
+          <w:sz w:val="48"/>
         </w:rPr>
         <w:t>Marco Morfin</w:t>
       </w:r>
     </w:p>
     <w:p>
       <w:pPr>
-        <w:spacing w:before="0" w:after="80" w:line="240" w:lineRule="auto"/>
+        <w:spacing w:after="80"/>
       </w:pPr>
       <w:r>
         <w:rPr>
-          <w:rFonts w:ascii="Arial" w:hAnsi="Arial"/>
-          <w:color w:val="5F6975"/>
+          <w:color w:val="5D6773"/>
           <w:sz w:val="17"/>
         </w:rPr>
-        <w:t>Entertainment Business · Community Management · Esports Operations</w:t>
+        <w:t>Community Management · Esports Strategist · Entertainment Business</w:t>
       </w:r>
     </w:p>
     <w:p>
       <w:pPr>
-        <w:spacing w:before="0" w:after="160" w:line="240" w:lineRule="auto"/>
-        <w:pBdr>
-          <w:bottom w:val="single" w:sz="6" w:space="1" w:color="D4D9DF"/>
-        </w:pBdr>
+        <w:spacing w:after="160"/>
       </w:pPr>
       <w:r>
         <w:rPr>
-          <w:rFonts w:ascii="Arial" w:hAnsi="Arial"/>
-          <w:color w:val="58616C"/>
+          <w:color w:val="606A76"/>
           <w:sz w:val="17"/>
         </w:rPr>
-        <w:t>Los Angeles, CA · (909) 441-6903 · m.m0rfiin@gmail.com · linkedin.com/in/marco-morfin · m0rfiin-m.github.io/m0rfiin-blog</w:t>
+        <w:t>Los Angeles, CA  ·  (909) 441-6903  ·  m.m0rfiin@gmail.com  ·  linkedin.com/in/marco-morfin  ·  m0rfiin-m.github.io</w:t>
       </w:r>
     </w:p>
+    <w:tbl>
+      <w:tblPr>
+        <w:tblW w:type="auto" w:w="0"/>
+        <w:tblLayout w:type="fixed"/>
+        <w:tblLook w:firstColumn="1" w:firstRow="1" w:lastColumn="0" w:lastRow="0" w:noHBand="0" w:noVBand="1" w:val="04A0"/>
+      </w:tblPr>
+      <w:tblGrid>
+        <w:gridCol w:w="2880"/>
+        <w:gridCol w:w="7056"/>
+      </w:tblGrid>
+      <w:tr>
+        <w:tc>
+          <w:tcPr>
+            <w:tcW w:type="dxa" w:w="2880"/>
+          </w:tcPr>
+          <w:p>
+            <w:pPr>
+              <w:spacing w:after="0"/>
+            </w:pPr>
+          </w:p>
+          <w:p>
+            <w:pPr>
+              <w:spacing w:before="120" w:after="80"/>
+            </w:pPr>
+            <w:r>
+              <w:rPr>
+                <w:b/>
+                <w:color w:val="54616C"/>
+                <w:sz w:val="18"/>
+              </w:rPr>
+              <w:t>EDUCATION</w:t>
+            </w:r>
+          </w:p>
+          <w:p>
+            <w:pPr>
+              <w:spacing w:after="20"/>
+            </w:pPr>
+            <w:r>
+              <w:rPr>
+                <w:b/>
+                <w:sz w:val="18"/>
+              </w:rPr>
+              <w:t>Full Sail University</w:t>
+            </w:r>
+          </w:p>
+          <w:p>
+            <w:pPr>
+              <w:spacing w:after="20"/>
+            </w:pPr>
+            <w:r>
+              <w:rPr>
+                <w:sz w:val="17"/>
+              </w:rPr>
+              <w:t>M.S. Entertainment Business</w:t>
+            </w:r>
+          </w:p>
+          <w:p>
+            <w:pPr>
+              <w:spacing w:after="60"/>
+            </w:pPr>
+            <w:r>
+              <w:rPr>
+                <w:color w:val="707983"/>
+                <w:sz w:val="16"/>
+              </w:rPr>
+              <w:t>Sep 2025 - Expected 2027</w:t>
+            </w:r>
+          </w:p>
+          <w:p>
+            <w:pPr>
+              <w:spacing w:after="20"/>
+            </w:pPr>
+            <w:r>
+              <w:rPr>
+                <w:b/>
+                <w:sz w:val="18"/>
+              </w:rPr>
+              <w:t>Harrisburg University</w:t>
+            </w:r>
+          </w:p>
+          <w:p>
+            <w:pPr>
+              <w:spacing w:after="20"/>
+            </w:pPr>
+            <w:r>
+              <w:rPr>
+                <w:sz w:val="17"/>
+              </w:rPr>
+              <w:t>B.S. Esports Management, Production &amp; Performance</w:t>
+            </w:r>
+          </w:p>
+          <w:p>
+            <w:pPr>
+              <w:spacing w:after="60"/>
+            </w:pPr>
+            <w:r>
+              <w:rPr>
+                <w:color w:val="707983"/>
+                <w:sz w:val="16"/>
+              </w:rPr>
+              <w:t>Aug 2022 - Aug 2025</w:t>
+            </w:r>
+          </w:p>
+          <w:p>
+            <w:pPr>
+              <w:spacing w:before="120" w:after="80"/>
+            </w:pPr>
+            <w:r>
+              <w:rPr>
+                <w:b/>
+                <w:color w:val="54616C"/>
+                <w:sz w:val="18"/>
+              </w:rPr>
+              <w:t>SKILLS</w:t>
+            </w:r>
+          </w:p>
+          <w:p>
+            <w:pPr>
+              <w:spacing w:after="20"/>
+            </w:pPr>
+            <w:r>
+              <w:rPr>
+                <w:b/>
+                <w:sz w:val="18"/>
+              </w:rPr>
+              <w:t>Community</w:t>
+            </w:r>
+          </w:p>
+          <w:p>
+            <w:pPr>
+              <w:spacing w:after="20"/>
+            </w:pPr>
+            <w:r>
+              <w:rPr>
+                <w:sz w:val="17"/>
+              </w:rPr>
+              <w:t>Community Management, Discord Operations, Fan Engagement, Community Events, Moderation Systems</w:t>
+            </w:r>
+          </w:p>
+          <w:p>
+            <w:pPr>
+              <w:spacing w:after="20"/>
+            </w:pPr>
+            <w:r>
+              <w:rPr>
+                <w:b/>
+                <w:sz w:val="18"/>
+              </w:rPr>
+              <w:t>Content &amp; Marketing</w:t>
+            </w:r>
+          </w:p>
+          <w:p>
+            <w:pPr>
+              <w:spacing w:after="20"/>
+            </w:pPr>
+            <w:r>
+              <w:rPr>
+                <w:sz w:val="17"/>
+              </w:rPr>
+              <w:t>Content Strategy, Content Writing, Social Media Marketing, Growth Marketing, SEO</w:t>
+            </w:r>
+          </w:p>
+          <w:p>
+            <w:pPr>
+              <w:spacing w:after="20"/>
+            </w:pPr>
+            <w:r>
+              <w:rPr>
+                <w:b/>
+                <w:sz w:val="18"/>
+              </w:rPr>
+              <w:t>Operations</w:t>
+            </w:r>
+          </w:p>
+          <w:p>
+            <w:pPr>
+              <w:spacing w:after="20"/>
+            </w:pPr>
+            <w:r>
+              <w:rPr>
+                <w:sz w:val="17"/>
+              </w:rPr>
+              <w:t>Tournament Operations, Sponsorship Development, Workflow Coordination, Project Management, Customer Service</w:t>
+            </w:r>
+          </w:p>
+          <w:p>
+            <w:pPr>
+              <w:spacing w:before="120" w:after="80"/>
+            </w:pPr>
+            <w:r>
+              <w:rPr>
+                <w:b/>
+                <w:color w:val="54616C"/>
+                <w:sz w:val="18"/>
+              </w:rPr>
+              <w:t>TOOLS</w:t>
+            </w:r>
+          </w:p>
+          <w:p>
+            <w:pPr>
+              <w:spacing w:after="40"/>
+            </w:pPr>
+            <w:r>
+              <w:rPr>
+                <w:sz w:val="17"/>
+              </w:rPr>
+              <w:t>Discord, Slack, Notion</w:t>
+            </w:r>
+          </w:p>
+          <w:p>
+            <w:pPr>
+              <w:spacing w:after="40"/>
+            </w:pPr>
+            <w:r>
+              <w:rPr>
+                <w:sz w:val="17"/>
+              </w:rPr>
+              <w:t>Hootsuite, Zoho Social, Later</w:t>
+            </w:r>
+          </w:p>
+          <w:p>
+            <w:pPr>
+              <w:spacing w:after="40"/>
+            </w:pPr>
+            <w:r>
+              <w:rPr>
+                <w:sz w:val="17"/>
+              </w:rPr>
+              <w:t>Canva, HubSpot, Microsoft 365</w:t>
+            </w:r>
+          </w:p>
+          <w:p>
+            <w:pPr>
+              <w:spacing w:after="40"/>
+            </w:pPr>
+            <w:r>
+              <w:rPr>
+                <w:sz w:val="17"/>
+              </w:rPr>
+              <w:t>Google Workspace, Figma</w:t>
+            </w:r>
+          </w:p>
+          <w:p>
+            <w:pPr>
+              <w:spacing w:after="40"/>
+            </w:pPr>
+            <w:r>
+              <w:rPr>
+                <w:sz w:val="17"/>
+              </w:rPr>
+              <w:t>MEE6, Dyno, OBS, Zoom</w:t>
+            </w:r>
+          </w:p>
+          <w:p>
+            <w:pPr>
+              <w:spacing w:before="120" w:after="80"/>
+            </w:pPr>
+            <w:r>
+              <w:rPr>
+                <w:b/>
+                <w:color w:val="54616C"/>
+                <w:sz w:val="18"/>
+              </w:rPr>
+              <w:t>CERTIFICATIONS</w:t>
+            </w:r>
+          </w:p>
+          <w:p>
+            <w:pPr>
+              <w:spacing w:after="40"/>
+            </w:pPr>
+            <w:r>
+              <w:rPr>
+                <w:sz w:val="17"/>
+              </w:rPr>
+              <w:t>LinkedIn Marketing Labs Certification</w:t>
+            </w:r>
+          </w:p>
+          <w:p>
+            <w:pPr>
+              <w:spacing w:after="40"/>
+            </w:pPr>
+            <w:r>
+              <w:rPr>
+                <w:sz w:val="17"/>
+              </w:rPr>
+              <w:t>HubSpot Social Media Marketing Certification</w:t>
+            </w:r>
+          </w:p>
+          <w:p>
+            <w:pPr>
+              <w:spacing w:after="40"/>
+            </w:pPr>
+            <w:r>
+              <w:rPr>
+                <w:sz w:val="17"/>
+              </w:rPr>
+              <w:t>Digital Marketing Foundations</w:t>
+            </w:r>
+          </w:p>
+          <w:p>
+            <w:pPr>
+              <w:spacing w:after="40"/>
+            </w:pPr>
+            <w:r>
+              <w:rPr>
+                <w:sz w:val="17"/>
+              </w:rPr>
+              <w:t>Content Marketing Foundations</w:t>
+            </w:r>
+          </w:p>
+          <w:p>
+            <w:pPr>
+              <w:spacing w:after="40"/>
+            </w:pPr>
+            <w:r>
+              <w:rPr>
+                <w:sz w:val="17"/>
+              </w:rPr>
+              <w:t>Agile Requirements Foundations</w:t>
+            </w:r>
+          </w:p>
+          <w:p>
+            <w:pPr>
+              <w:spacing w:after="40"/>
+            </w:pPr>
+            <w:r>
+              <w:rPr>
+                <w:sz w:val="17"/>
+              </w:rPr>
+              <w:t>Figma Essential Training</w:t>
+            </w:r>
+          </w:p>
+          <w:p>
+            <w:pPr>
+              <w:spacing w:before="120" w:after="80"/>
+            </w:pPr>
+            <w:r>
+              <w:rPr>
+                <w:b/>
+                <w:color w:val="54616C"/>
+                <w:sz w:val="18"/>
+              </w:rPr>
+              <w:t>LANGUAGES</w:t>
+            </w:r>
+          </w:p>
+          <w:p>
+            <w:pPr>
+              <w:spacing w:after="40"/>
+            </w:pPr>
+            <w:r>
+              <w:rPr>
+                <w:sz w:val="17"/>
+              </w:rPr>
+              <w:t>English (Native)</w:t>
+            </w:r>
+          </w:p>
+          <w:p>
+            <w:pPr>
+              <w:spacing w:after="40"/>
+            </w:pPr>
+            <w:r>
+              <w:rPr>
+                <w:sz w:val="17"/>
+              </w:rPr>
+              <w:t>Spanish (Bilingual)</w:t>
+            </w:r>
+          </w:p>
+        </w:tc>
+        <w:tc>
+          <w:tcPr>
+            <w:tcW w:type="dxa" w:w="7056"/>
+          </w:tcPr>
+          <w:p>
+            <w:pPr>
+              <w:spacing w:after="0"/>
+            </w:pPr>
+          </w:p>
+          <w:p>
+            <w:pPr>
+              <w:spacing w:after="80"/>
+            </w:pPr>
+            <w:r>
+              <w:rPr>
+                <w:b/>
+                <w:color w:val="54616C"/>
+                <w:sz w:val="18"/>
+              </w:rPr>
+              <w:t>PROFESSIONAL SUMMARY</w:t>
+            </w:r>
+          </w:p>
+          <w:p>
+            <w:r>
+              <w:t>Entertainment business professional with 8+ years of experience across community management, esports operations, customer service, and technical support. Managed a 15,921-member Discord community, increased engagement by 35%, and developed sponsorship and operations materials for a sports marketing agency's esports division.</w:t>
+            </w:r>
+          </w:p>
+          <w:p>
+            <w:pPr>
+              <w:spacing w:before="120" w:after="80"/>
+            </w:pPr>
+            <w:r>
+              <w:rPr>
+                <w:b/>
+                <w:color w:val="54616C"/>
+                <w:sz w:val="18"/>
+              </w:rPr>
+              <w:t>EXPERIENCE</w:t>
+            </w:r>
+          </w:p>
+          <w:p>
+            <w:pPr>
+              <w:spacing w:after="20"/>
+            </w:pPr>
+            <w:r>
+              <w:rPr>
+                <w:b/>
+                <w:sz w:val="20"/>
+              </w:rPr>
+              <w:t>Esports League Development Volunteer</w:t>
+            </w:r>
+          </w:p>
+          <w:p>
+            <w:pPr>
+              <w:spacing w:after="40"/>
+            </w:pPr>
+            <w:r>
+              <w:rPr>
+                <w:i/>
+                <w:color w:val="707983"/>
+                <w:sz w:val="16"/>
+              </w:rPr>
+              <w:t>Sports Media Inc. · Los Angeles, CA (Remote) · June 2025 - May 2026</w:t>
+            </w:r>
+          </w:p>
+          <w:p>
+            <w:pPr>
+              <w:pStyle w:val="ListBullet"/>
+              <w:spacing w:after="20"/>
+              <w:ind w:left="288" w:hanging="187"/>
+            </w:pPr>
+            <w:r>
+              <w:t>Developed sponsorship proposals and supporting documentation for the esports division of a sports marketing agency with 780+ venue partnerships.</w:t>
+            </w:r>
+          </w:p>
+          <w:p>
+            <w:pPr>
+              <w:pStyle w:val="ListBullet"/>
+              <w:spacing w:after="20"/>
+              <w:ind w:left="288" w:hanging="187"/>
+            </w:pPr>
+            <w:r>
+              <w:t>Collaborated with legal and content teams to align partnership materials with brand standards and internal review requirements.</w:t>
+            </w:r>
+          </w:p>
+          <w:p>
+            <w:pPr>
+              <w:pStyle w:val="ListBullet"/>
+              <w:spacing w:after="20"/>
+              <w:ind w:left="288" w:hanging="187"/>
+            </w:pPr>
+            <w:r>
+              <w:t>Organized tournament operations, including scheduling, registration tracking, and ruleset documentation for competitive gaming programs.</w:t>
+            </w:r>
+          </w:p>
+          <w:p>
+            <w:pPr>
+              <w:pStyle w:val="ListBullet"/>
+              <w:spacing w:after="20"/>
+              <w:ind w:left="288" w:hanging="187"/>
+            </w:pPr>
+            <w:r>
+              <w:t>Managed shared workflows and cross-department communication using Google Drive, Slack, and AI-assisted productivity tools.</w:t>
+            </w:r>
+          </w:p>
+          <w:p>
+            <w:pPr>
+              <w:spacing w:after="20"/>
+            </w:pPr>
+            <w:r>
+              <w:rPr>
+                <w:b/>
+                <w:sz w:val="20"/>
+              </w:rPr>
+              <w:t>Discord &amp; Community Manager</w:t>
+            </w:r>
+          </w:p>
+          <w:p>
+            <w:pPr>
+              <w:spacing w:after="40"/>
+            </w:pPr>
+            <w:r>
+              <w:rPr>
+                <w:i/>
+                <w:color w:val="707983"/>
+                <w:sz w:val="16"/>
+              </w:rPr>
+              <w:t>Tanbii · Los Angeles, CA (Remote) · February 2025 - June 2025</w:t>
+            </w:r>
+          </w:p>
+          <w:p>
+            <w:pPr>
+              <w:pStyle w:val="ListBullet"/>
+              <w:spacing w:after="20"/>
+              <w:ind w:left="288" w:hanging="187"/>
+            </w:pPr>
+            <w:r>
+              <w:t>Managed and grew a Discord community of 15,921 members, increasing engagement by 35% through events, contests, and Q&amp;A campaigns.</w:t>
+            </w:r>
+          </w:p>
+          <w:p>
+            <w:pPr>
+              <w:pStyle w:val="ListBullet"/>
+              <w:spacing w:after="20"/>
+              <w:ind w:left="288" w:hanging="187"/>
+            </w:pPr>
+            <w:r>
+              <w:t>Designed and launched the Tanbii Internship Challenge, a four-category competition that added 532 members over six months.</w:t>
+            </w:r>
+          </w:p>
+          <w:p>
+            <w:pPr>
+              <w:pStyle w:val="ListBullet"/>
+              <w:spacing w:after="20"/>
+              <w:ind w:left="288" w:hanging="187"/>
+            </w:pPr>
+            <w:r>
+              <w:t>Maintained a cross-platform content calendar across Instagram, TikTok, Facebook, and X in coordination with marketing initiatives.</w:t>
+            </w:r>
+          </w:p>
+          <w:p>
+            <w:pPr>
+              <w:pStyle w:val="ListBullet"/>
+              <w:spacing w:after="20"/>
+              <w:ind w:left="288" w:hanging="187"/>
+            </w:pPr>
+            <w:r>
+              <w:t>Built moderation workflows and automation systems with MEE6 and Dyno to support community health at scale.</w:t>
+            </w:r>
+          </w:p>
+          <w:p>
+            <w:pPr>
+              <w:pStyle w:val="ListBullet"/>
+              <w:spacing w:after="20"/>
+              <w:ind w:left="288" w:hanging="187"/>
+            </w:pPr>
+            <w:r>
+              <w:t>Reported audience feedback and behavior trends to product and marketing stakeholders to inform decisions.</w:t>
+            </w:r>
+          </w:p>
+          <w:p>
+            <w:pPr>
+              <w:spacing w:after="20"/>
+            </w:pPr>
+            <w:r>
+              <w:rPr>
+                <w:b/>
+                <w:sz w:val="20"/>
+              </w:rPr>
+              <w:t>Customer Service Representative II</w:t>
+            </w:r>
+          </w:p>
+          <w:p>
+            <w:pPr>
+              <w:spacing w:after="40"/>
+            </w:pPr>
+            <w:r>
+              <w:rPr>
+                <w:i/>
+                <w:color w:val="707983"/>
+                <w:sz w:val="16"/>
+              </w:rPr>
+              <w:t>Optum / UnitedHealth Group · Remote · February 2023 - September 2024</w:t>
+            </w:r>
+          </w:p>
+          <w:p>
+            <w:pPr>
+              <w:pStyle w:val="ListBullet"/>
+              <w:spacing w:after="20"/>
+              <w:ind w:left="288" w:hanging="187"/>
+            </w:pPr>
+            <w:r>
+              <w:t>Handled 50+ inbound calls daily, authorizing treatment for mental health and substance abuse cases across multiple levels of care.</w:t>
+            </w:r>
+          </w:p>
+          <w:p>
+            <w:pPr>
+              <w:pStyle w:val="ListBullet"/>
+              <w:spacing w:after="20"/>
+              <w:ind w:left="288" w:hanging="187"/>
+            </w:pPr>
+            <w:r>
+              <w:t>Managed an active member caseload, ensuring care met medical necessity guidelines and connecting members with crisis and support resources.</w:t>
+            </w:r>
+          </w:p>
+          <w:p>
+            <w:pPr>
+              <w:pStyle w:val="ListBullet"/>
+              <w:spacing w:after="20"/>
+              <w:ind w:left="288" w:hanging="187"/>
+            </w:pPr>
+            <w:r>
+              <w:t>Resolved escalated issues across multiple systems, including iSETT, CDB, and LINX, in partnership with clinical and support teams.</w:t>
+            </w:r>
+          </w:p>
+          <w:p>
+            <w:pPr>
+              <w:spacing w:after="20"/>
+            </w:pPr>
+            <w:r>
+              <w:rPr>
+                <w:b/>
+                <w:sz w:val="20"/>
+              </w:rPr>
+              <w:t>Sr. Benefit Audit Agent / Sr. Customer Service Representative</w:t>
+            </w:r>
+          </w:p>
+          <w:p>
+            <w:pPr>
+              <w:spacing w:after="40"/>
+            </w:pPr>
+            <w:r>
+              <w:rPr>
+                <w:i/>
+                <w:color w:val="707983"/>
+                <w:sz w:val="16"/>
+              </w:rPr>
+              <w:t>Aerotek (Contract for Maximus) · Remote / Fontana, CA · January 2022 - January 2023</w:t>
+            </w:r>
+          </w:p>
+          <w:p>
+            <w:pPr>
+              <w:pStyle w:val="ListBullet"/>
+              <w:spacing w:after="20"/>
+              <w:ind w:left="288" w:hanging="187"/>
+            </w:pPr>
+            <w:r>
+              <w:t>Reviewed unemployment insurance claims against policy and UI code requirements to identify discrepancies across a high-volume caseload.</w:t>
+            </w:r>
+          </w:p>
+          <w:p>
+            <w:pPr>
+              <w:pStyle w:val="ListBullet"/>
+              <w:spacing w:after="20"/>
+              <w:ind w:left="288" w:hanging="187"/>
+            </w:pPr>
+            <w:r>
+              <w:t>Resolved complex wage and benefit cross-matching issues while coordinating with subject matter experts on escalations.</w:t>
+            </w:r>
+          </w:p>
+          <w:p>
+            <w:pPr>
+              <w:pStyle w:val="ListBullet"/>
+              <w:spacing w:after="20"/>
+              <w:ind w:left="288" w:hanging="187"/>
+            </w:pPr>
+            <w:r>
+              <w:t>Trained and mentored junior team members on audit workflows, documentation quality, and case handling practices.</w:t>
+            </w:r>
+          </w:p>
+          <w:p>
+            <w:pPr>
+              <w:spacing w:after="20"/>
+            </w:pPr>
+            <w:r>
+              <w:rPr>
+                <w:b/>
+                <w:sz w:val="20"/>
+              </w:rPr>
+              <w:t>Overnight Family Liaison &amp; Logistics Specialist</w:t>
+            </w:r>
+          </w:p>
+          <w:p>
+            <w:pPr>
+              <w:spacing w:after="40"/>
+            </w:pPr>
+            <w:r>
+              <w:rPr>
+                <w:i/>
+                <w:color w:val="707983"/>
+                <w:sz w:val="16"/>
+              </w:rPr>
+              <w:t>Team Hope (Cherokee Federal / HHS Emergency Intake Site) · Pomona, CA · May 2021 - November 2021</w:t>
+            </w:r>
+          </w:p>
+          <w:p>
+            <w:pPr>
+              <w:pStyle w:val="ListBullet"/>
+              <w:spacing w:after="20"/>
+              <w:ind w:left="288" w:hanging="187"/>
+            </w:pPr>
+            <w:r>
+              <w:t>Supported secure family communication for unaccompanied youth while maintaining privacy expectations and HHS compliance.</w:t>
+            </w:r>
+          </w:p>
+          <w:p>
+            <w:pPr>
+              <w:pStyle w:val="ListBullet"/>
+              <w:spacing w:after="20"/>
+              <w:ind w:left="288" w:hanging="187"/>
+            </w:pPr>
+            <w:r>
+              <w:t>Coordinated overnight distribution of emergency supplies, helping ensure children received required clothing, bedding, and care items.</w:t>
+            </w:r>
+          </w:p>
+          <w:p>
+            <w:pPr>
+              <w:pStyle w:val="ListBullet"/>
+              <w:spacing w:after="20"/>
+              <w:ind w:left="288" w:hanging="187"/>
+            </w:pPr>
+            <w:r>
+              <w:t>Provided calm, trauma-informed support during overnight operations in a high-pressure humanitarian response environment.</w:t>
+            </w:r>
+          </w:p>
+          <w:p>
+            <w:pPr>
+              <w:spacing w:after="20"/>
+            </w:pPr>
+            <w:r>
+              <w:rPr>
+                <w:b/>
+                <w:sz w:val="20"/>
+              </w:rPr>
+              <w:t>Patient Service Representative</w:t>
+            </w:r>
+          </w:p>
+          <w:p>
+            <w:pPr>
+              <w:spacing w:after="40"/>
+            </w:pPr>
+            <w:r>
+              <w:rPr>
+                <w:i/>
+                <w:color w:val="707983"/>
+                <w:sz w:val="16"/>
+              </w:rPr>
+              <w:t>Kaiser Permanente · Fontana, CA · January 2021 - September 2021</w:t>
+            </w:r>
+          </w:p>
+          <w:p>
+            <w:pPr>
+              <w:pStyle w:val="ListBullet"/>
+              <w:spacing w:after="20"/>
+              <w:ind w:left="288" w:hanging="187"/>
+            </w:pPr>
+            <w:r>
+              <w:t>Verified patient information, processed payments, and assisted with history, consent, and account inquiries in a high-traffic medical setting.</w:t>
+            </w:r>
+          </w:p>
+        </w:tc>
+      </w:tr>
+    </w:tbl>
     <w:p>
       <w:pPr>
-        <w:spacing w:before="240" w:after="100" w:line="240" w:lineRule="auto"/>
-        <w:pBdr>
-          <w:bottom w:val="single" w:sz="6" w:space="1" w:color="D4D9DF"/>
-        </w:pBdr>
+        <w:spacing w:before="160" w:after="80"/>
       </w:pPr>
       <w:r>
         <w:rPr>
-          <w:rFonts w:ascii="Arial" w:hAnsi="Arial"/>
           <w:b/>
-          <w:color w:val="4F5964"/>
-          <w:sz w:val="19"/>
-        </w:rPr>
-        <w:t>PROFESSIONAL SUMMARY</w:t>
-      </w:r>
-    </w:p>
-    <w:p>
-      <w:pPr>
-        <w:spacing w:before="0" w:after="80" w:line="259" w:lineRule="auto"/>
-      </w:pPr>
-      <w:r>
-        <w:t>Entertainment business professional with 8+ years of experience across community management, esports operations, customer service, and technical support. Managed a 15,921-member Discord community, increased engagement by 35%, and developed sponsorship and operations materials for a sports marketing agency's esports division.</w:t>
-      </w:r>
-    </w:p>
-    <w:p>
-      <w:pPr>
-        <w:spacing w:before="240" w:after="100" w:line="240" w:lineRule="auto"/>
-        <w:pBdr>
-          <w:bottom w:val="single" w:sz="6" w:space="1" w:color="D4D9DF"/>
-        </w:pBdr>
-      </w:pPr>
-      <w:r>
-        <w:rPr>
-          <w:rFonts w:ascii="Arial" w:hAnsi="Arial"/>
-          <w:b/>
-          <w:color w:val="4F5964"/>
-          <w:sz w:val="19"/>
+          <w:color w:val="54616C"/>
+          <w:sz w:val="18"/>
         </w:rPr>
         <w:t>EXPERIENCE</w:t>
       </w:r>
     </w:p>
     <w:p>
       <w:pPr>
-        <w:spacing w:before="100" w:after="20" w:line="240" w:lineRule="auto"/>
+        <w:spacing w:after="20"/>
       </w:pPr>
       <w:r>
         <w:rPr>
-          <w:rFonts w:ascii="Arial" w:hAnsi="Arial"/>
           <w:b/>
-          <w:color w:val="171C22"/>
-          <w:sz w:val="22"/>
-        </w:rPr>
-        <w:t>Esports League Development Volunteer</w:t>
-      </w:r>
-    </w:p>
-    <w:p>
-      <w:pPr>
-        <w:spacing w:before="0" w:after="60" w:line="240" w:lineRule="auto"/>
-      </w:pPr>
-      <w:r>
-        <w:rPr>
-          <w:rFonts w:ascii="Arial" w:hAnsi="Arial"/>
-          <w:i/>
-          <w:color w:val="707983"/>
-          <w:sz w:val="17"/>
-        </w:rPr>
-        <w:t>Sports Media Inc. · Los Angeles, CA (Remote) · June 2025 – May 2026</w:t>
-      </w:r>
-    </w:p>
-    <w:p>
-      <w:pPr>
-        <w:pStyle w:val="ListBullet"/>
-        <w:spacing w:before="0" w:after="40" w:line="259" w:lineRule="auto"/>
-        <w:ind w:left="317" w:hanging="202"/>
-      </w:pPr>
-      <w:r>
-        <w:t>Developed sponsorship proposals and supporting documentation for the esports division of a sports marketing agency with 780+ venue partnerships.</w:t>
-      </w:r>
-    </w:p>
-    <w:p>
-      <w:pPr>
-        <w:pStyle w:val="ListBullet"/>
-        <w:spacing w:before="0" w:after="40" w:line="259" w:lineRule="auto"/>
-        <w:ind w:left="317" w:hanging="202"/>
-      </w:pPr>
-      <w:r>
-        <w:t>Collaborated with legal and content teams to align partnership materials with brand standards and internal review requirements.</w:t>
-      </w:r>
-    </w:p>
-    <w:p>
-      <w:pPr>
-        <w:pStyle w:val="ListBullet"/>
-        <w:spacing w:before="0" w:after="40" w:line="259" w:lineRule="auto"/>
-        <w:ind w:left="317" w:hanging="202"/>
-      </w:pPr>
-      <w:r>
-        <w:t>Organized tournament operations, including scheduling, registration tracking, and ruleset documentation for competitive gaming programs.</w:t>
-      </w:r>
-    </w:p>
-    <w:p>
-      <w:pPr>
-        <w:pStyle w:val="ListBullet"/>
-        <w:spacing w:before="0" w:after="40" w:line="259" w:lineRule="auto"/>
-        <w:ind w:left="317" w:hanging="202"/>
-      </w:pPr>
-      <w:r>
-        <w:t>Managed shared workflows and cross-department communication using Google Drive, Slack, and AI-assisted productivity tools.</w:t>
-      </w:r>
-    </w:p>
-    <w:p>
-      <w:pPr>
-        <w:spacing w:before="100" w:after="20" w:line="240" w:lineRule="auto"/>
-      </w:pPr>
-      <w:r>
-        <w:rPr>
-          <w:rFonts w:ascii="Arial" w:hAnsi="Arial"/>
-          <w:b/>
-          <w:color w:val="171C22"/>
-          <w:sz w:val="22"/>
-        </w:rPr>
-        <w:t>Discord &amp; Community Manager</w:t>
-      </w:r>
-    </w:p>
-    <w:p>
-      <w:pPr>
-        <w:spacing w:before="0" w:after="60" w:line="240" w:lineRule="auto"/>
-      </w:pPr>
-      <w:r>
-        <w:rPr>
-          <w:rFonts w:ascii="Arial" w:hAnsi="Arial"/>
-          <w:i/>
-          <w:color w:val="707983"/>
-          <w:sz w:val="17"/>
-        </w:rPr>
-        <w:t>Tanbii · Los Angeles, CA (Remote) · February 2025 – June 2025</w:t>
-      </w:r>
-    </w:p>
-    <w:p>
-      <w:pPr>
-        <w:pStyle w:val="ListBullet"/>
-        <w:spacing w:before="0" w:after="40" w:line="259" w:lineRule="auto"/>
-        <w:ind w:left="317" w:hanging="202"/>
-      </w:pPr>
-      <w:r>
-        <w:t>Managed and grew a Discord community of 15,921 members, increasing engagement by 35% through events, contests, and Q&amp;A campaigns.</w:t>
-      </w:r>
-    </w:p>
-    <w:p>
-      <w:pPr>
-        <w:pStyle w:val="ListBullet"/>
-        <w:spacing w:before="0" w:after="40" w:line="259" w:lineRule="auto"/>
-        <w:ind w:left="317" w:hanging="202"/>
-      </w:pPr>
-      <w:r>
-        <w:t>Designed and launched the Tanbii Internship Challenge, a four-category competition that added 532 members over six months.</w:t>
-      </w:r>
-    </w:p>
-    <w:p>
-      <w:pPr>
-        <w:pStyle w:val="ListBullet"/>
-        <w:spacing w:before="0" w:after="40" w:line="259" w:lineRule="auto"/>
-        <w:ind w:left="317" w:hanging="202"/>
-      </w:pPr>
-      <w:r>
-        <w:t>Maintained a cross-platform content calendar across Instagram, TikTok, Facebook, and X in coordination with marketing initiatives.</w:t>
-      </w:r>
-    </w:p>
-    <w:p>
-      <w:pPr>
-        <w:pStyle w:val="ListBullet"/>
-        <w:spacing w:before="0" w:after="40" w:line="259" w:lineRule="auto"/>
-        <w:ind w:left="317" w:hanging="202"/>
-      </w:pPr>
-      <w:r>
-        <w:t>Built moderation workflows and automation systems with MEE6 and Dyno to support community health at scale.</w:t>
-      </w:r>
-    </w:p>
-    <w:p>
-      <w:pPr>
-        <w:pStyle w:val="ListBullet"/>
-        <w:spacing w:before="0" w:after="40" w:line="259" w:lineRule="auto"/>
-        <w:ind w:left="317" w:hanging="202"/>
-      </w:pPr>
-      <w:r>
-        <w:t>Reported audience feedback and behavior trends to product and marketing stakeholders to inform decisions.</w:t>
-      </w:r>
-    </w:p>
-    <w:p>
-      <w:pPr>
-        <w:spacing w:before="100" w:after="20" w:line="240" w:lineRule="auto"/>
-      </w:pPr>
-      <w:r>
-        <w:rPr>
-          <w:rFonts w:ascii="Arial" w:hAnsi="Arial"/>
-          <w:b/>
-          <w:color w:val="171C22"/>
-          <w:sz w:val="22"/>
-        </w:rPr>
-        <w:t>Customer Service Representative II</w:t>
-      </w:r>
-    </w:p>
-    <w:p>
-      <w:pPr>
-        <w:spacing w:before="0" w:after="60" w:line="240" w:lineRule="auto"/>
-      </w:pPr>
-      <w:r>
-        <w:rPr>
-          <w:rFonts w:ascii="Arial" w:hAnsi="Arial"/>
-          <w:i/>
-          <w:color w:val="707983"/>
-          <w:sz w:val="17"/>
-        </w:rPr>
-        <w:t>Optum / UnitedHealth Group · Remote · February 2023 – September 2024</w:t>
-      </w:r>
-    </w:p>
-    <w:p>
-      <w:pPr>
-        <w:pStyle w:val="ListBullet"/>
-        <w:spacing w:before="0" w:after="40" w:line="259" w:lineRule="auto"/>
-        <w:ind w:left="317" w:hanging="202"/>
-      </w:pPr>
-      <w:r>
-        <w:t>Handled 50+ inbound calls daily, authorizing treatment for mental health and substance abuse cases across multiple levels of care.</w:t>
-      </w:r>
-    </w:p>
-    <w:p>
-      <w:pPr>
-        <w:pStyle w:val="ListBullet"/>
-        <w:spacing w:before="0" w:after="40" w:line="259" w:lineRule="auto"/>
-        <w:ind w:left="317" w:hanging="202"/>
-      </w:pPr>
-      <w:r>
-        <w:t>Managed an active member caseload, ensuring care met medical necessity guidelines and connecting members with crisis and support resources.</w:t>
-      </w:r>
-    </w:p>
-    <w:p>
-      <w:pPr>
-        <w:pStyle w:val="ListBullet"/>
-        <w:spacing w:before="0" w:after="40" w:line="259" w:lineRule="auto"/>
-        <w:ind w:left="317" w:hanging="202"/>
-      </w:pPr>
-      <w:r>
-        <w:t>Resolved escalated issues across multiple systems, including iSETT, CDB, and LINX, in partnership with clinical and support teams.</w:t>
-      </w:r>
-    </w:p>
-    <w:p>
-      <w:pPr>
-        <w:spacing w:before="100" w:after="20" w:line="240" w:lineRule="auto"/>
-      </w:pPr>
-      <w:r>
-        <w:rPr>
-          <w:rFonts w:ascii="Arial" w:hAnsi="Arial"/>
-          <w:b/>
-          <w:color w:val="171C22"/>
-          <w:sz w:val="22"/>
-        </w:rPr>
-        <w:t>Sr. Benefit Audit Agent / Sr. Customer Service Representative</w:t>
-      </w:r>
-    </w:p>
-    <w:p>
-      <w:pPr>
-        <w:spacing w:before="0" w:after="60" w:line="240" w:lineRule="auto"/>
-      </w:pPr>
-      <w:r>
-        <w:rPr>
-          <w:rFonts w:ascii="Arial" w:hAnsi="Arial"/>
-          <w:i/>
-          <w:color w:val="707983"/>
-          <w:sz w:val="17"/>
-        </w:rPr>
-        <w:t>Aerotek (Contract for Maximus) · Remote / Fontana, CA · January 2022 – January 2023</w:t>
-      </w:r>
-    </w:p>
-    <w:p>
-      <w:pPr>
-        <w:pStyle w:val="ListBullet"/>
-        <w:spacing w:before="0" w:after="40" w:line="259" w:lineRule="auto"/>
-        <w:ind w:left="317" w:hanging="202"/>
-      </w:pPr>
-      <w:r>
-        <w:t>Reviewed unemployment insurance claims against policy and UI code requirements to identify discrepancies across a high-volume caseload.</w:t>
-      </w:r>
-    </w:p>
-    <w:p>
-      <w:pPr>
-        <w:pStyle w:val="ListBullet"/>
-        <w:spacing w:before="0" w:after="40" w:line="259" w:lineRule="auto"/>
-        <w:ind w:left="317" w:hanging="202"/>
-      </w:pPr>
-      <w:r>
-        <w:t>Resolved complex wage and benefit cross-matching issues while coordinating with subject matter experts on escalations.</w:t>
-      </w:r>
-    </w:p>
-    <w:p>
-      <w:pPr>
-        <w:pStyle w:val="ListBullet"/>
-        <w:spacing w:before="0" w:after="40" w:line="259" w:lineRule="auto"/>
-        <w:ind w:left="317" w:hanging="202"/>
-      </w:pPr>
-      <w:r>
-        <w:t>Trained and mentored junior team members on audit workflows, documentation quality, and case handling practices.</w:t>
-      </w:r>
-    </w:p>
-    <w:p>
-      <w:pPr>
-        <w:spacing w:before="100" w:after="20" w:line="240" w:lineRule="auto"/>
-      </w:pPr>
-      <w:r>
-        <w:rPr>
-          <w:rFonts w:ascii="Arial" w:hAnsi="Arial"/>
-          <w:b/>
-          <w:color w:val="171C22"/>
-          <w:sz w:val="22"/>
-        </w:rPr>
-        <w:t>Overnight Family Liaison &amp; Logistics Specialist</w:t>
-      </w:r>
-    </w:p>
-    <w:p>
-      <w:pPr>
-        <w:spacing w:before="0" w:after="60" w:line="240" w:lineRule="auto"/>
-      </w:pPr>
-      <w:r>
-        <w:rPr>
-          <w:rFonts w:ascii="Arial" w:hAnsi="Arial"/>
-          <w:i/>
-          <w:color w:val="707983"/>
-          <w:sz w:val="17"/>
-        </w:rPr>
-        <w:t>Team Hope (Cherokee Federal / HHS Emergency Intake Site) · Pomona, CA · May 2021 – November 2021</w:t>
-      </w:r>
-    </w:p>
-    <w:p>
-      <w:pPr>
-        <w:pStyle w:val="ListBullet"/>
-        <w:spacing w:before="0" w:after="40" w:line="259" w:lineRule="auto"/>
-        <w:ind w:left="317" w:hanging="202"/>
-      </w:pPr>
-      <w:r>
-        <w:t>Supported secure family communication for unaccompanied youth while maintaining privacy expectations and HHS compliance.</w:t>
-      </w:r>
-    </w:p>
-    <w:p>
-      <w:pPr>
-        <w:pStyle w:val="ListBullet"/>
-        <w:spacing w:before="0" w:after="40" w:line="259" w:lineRule="auto"/>
-        <w:ind w:left="317" w:hanging="202"/>
-      </w:pPr>
-      <w:r>
-        <w:t>Coordinated overnight distribution of emergency supplies, helping ensure children received required clothing, bedding, and care items.</w:t>
-      </w:r>
-    </w:p>
-    <w:p>
-      <w:pPr>
-        <w:pStyle w:val="ListBullet"/>
-        <w:spacing w:before="0" w:after="40" w:line="259" w:lineRule="auto"/>
-        <w:ind w:left="317" w:hanging="202"/>
-      </w:pPr>
-      <w:r>
-        <w:t>Provided calm, trauma-informed support during overnight operations in a high-pressure humanitarian response environment.</w:t>
-      </w:r>
-    </w:p>
-    <w:p>
-      <w:pPr>
-        <w:spacing w:before="100" w:after="20" w:line="240" w:lineRule="auto"/>
-      </w:pPr>
-      <w:r>
-        <w:rPr>
-          <w:rFonts w:ascii="Arial" w:hAnsi="Arial"/>
-          <w:b/>
-          <w:color w:val="171C22"/>
-          <w:sz w:val="22"/>
-        </w:rPr>
-        <w:t>Patient Service Representative</w:t>
-      </w:r>
-    </w:p>
-    <w:p>
-      <w:pPr>
-        <w:spacing w:before="0" w:after="60" w:line="240" w:lineRule="auto"/>
-      </w:pPr>
-      <w:r>
-        <w:rPr>
-          <w:rFonts w:ascii="Arial" w:hAnsi="Arial"/>
-          <w:i/>
-          <w:color w:val="707983"/>
-          <w:sz w:val="17"/>
-        </w:rPr>
-        <w:t>Kaiser Permanente · Fontana, CA · January 2021 – September 2021</w:t>
-      </w:r>
-    </w:p>
-    <w:p>
-      <w:pPr>
-        <w:pStyle w:val="ListBullet"/>
-        <w:spacing w:before="0" w:after="40" w:line="259" w:lineRule="auto"/>
-        <w:ind w:left="317" w:hanging="202"/>
-      </w:pPr>
-      <w:r>
-        <w:t>Verified patient information, processed payments, and assisted with history, consent, and account inquiries in a high-traffic medical setting.</w:t>
-      </w:r>
-    </w:p>
-    <w:p>
-      <w:pPr>
-        <w:spacing w:before="100" w:after="20" w:line="240" w:lineRule="auto"/>
-      </w:pPr>
-      <w:r>
-        <w:rPr>
-          <w:rFonts w:ascii="Arial" w:hAnsi="Arial"/>
-          <w:b/>
-          <w:color w:val="171C22"/>
-          <w:sz w:val="22"/>
+          <w:sz w:val="21"/>
         </w:rPr>
         <w:t>Call Center Representative</w:t>
       </w:r>
     </w:p>
     <w:p>
       <w:pPr>
-        <w:spacing w:before="0" w:after="60" w:line="240" w:lineRule="auto"/>
+        <w:spacing w:after="40"/>
       </w:pPr>
       <w:r>
         <w:rPr>
-          <w:rFonts w:ascii="Arial" w:hAnsi="Arial"/>
           <w:i/>
           <w:color w:val="707983"/>
           <w:sz w:val="17"/>
         </w:rPr>
-        <w:t>American Security Products (AMSEC) · Fontana, CA · May 2019 – October 2020</w:t>
+        <w:t>American Security Products (AMSEC) · Fontana, CA · May 2019 - October 2020</w:t>
       </w:r>
     </w:p>
     <w:p>
       <w:pPr>
         <w:pStyle w:val="ListBullet"/>
-        <w:spacing w:before="0" w:after="40" w:line="259" w:lineRule="auto"/>
-        <w:ind w:left="317" w:hanging="202"/>
+        <w:spacing w:after="20"/>
+        <w:ind w:left="288" w:hanging="187"/>
       </w:pPr>
       <w:r>
         <w:t>Diagnosed mechanical and electronic lock issues through inbound support calls and coordinated locksmith scheduling.</w:t>
@@ -487,8 +841,8 @@
     <w:p>
       <w:pPr>
         <w:pStyle w:val="ListBullet"/>
-        <w:spacing w:before="0" w:after="40" w:line="259" w:lineRule="auto"/>
-        <w:ind w:left="317" w:hanging="202"/>
+        <w:spacing w:after="20"/>
+        <w:ind w:left="288" w:hanging="187"/>
       </w:pPr>
       <w:r>
         <w:t>Logged service activity in SafeManager and trained new hires on customer service procedures and documentation practices.</w:t>
@@ -496,37 +850,34 @@
     </w:p>
     <w:p>
       <w:pPr>
-        <w:spacing w:before="100" w:after="20" w:line="240" w:lineRule="auto"/>
+        <w:spacing w:after="20"/>
       </w:pPr>
       <w:r>
         <w:rPr>
-          <w:rFonts w:ascii="Arial" w:hAnsi="Arial"/>
           <w:b/>
-          <w:color w:val="171C22"/>
-          <w:sz w:val="22"/>
+          <w:sz w:val="21"/>
         </w:rPr>
         <w:t>Network Technician</w:t>
       </w:r>
     </w:p>
     <w:p>
       <w:pPr>
-        <w:spacing w:before="0" w:after="60" w:line="240" w:lineRule="auto"/>
+        <w:spacing w:after="40"/>
       </w:pPr>
       <w:r>
         <w:rPr>
-          <w:rFonts w:ascii="Arial" w:hAnsi="Arial"/>
           <w:i/>
           <w:color w:val="707983"/>
           <w:sz w:val="17"/>
         </w:rPr>
-        <w:t>Charter Communications · Ontario, CA · February 2018 – April 2019</w:t>
+        <w:t>Charter Communications · Ontario, CA · February 2018 - April 2019</w:t>
       </w:r>
     </w:p>
     <w:p>
       <w:pPr>
         <w:pStyle w:val="ListBullet"/>
-        <w:spacing w:before="0" w:after="40" w:line="259" w:lineRule="auto"/>
-        <w:ind w:left="317" w:hanging="202"/>
+        <w:spacing w:after="20"/>
+        <w:ind w:left="288" w:hanging="187"/>
       </w:pPr>
       <w:r>
         <w:t>Restored business and residential network service by troubleshooting LAN issues, hardware failures, and software configuration problems.</w:t>
@@ -534,37 +885,34 @@
     </w:p>
     <w:p>
       <w:pPr>
-        <w:spacing w:before="100" w:after="20" w:line="240" w:lineRule="auto"/>
+        <w:spacing w:after="20"/>
       </w:pPr>
       <w:r>
         <w:rPr>
-          <w:rFonts w:ascii="Arial" w:hAnsi="Arial"/>
           <w:b/>
-          <w:color w:val="171C22"/>
-          <w:sz w:val="22"/>
+          <w:sz w:val="21"/>
         </w:rPr>
         <w:t>Call Center Representative</w:t>
       </w:r>
     </w:p>
     <w:p>
       <w:pPr>
-        <w:spacing w:before="0" w:after="60" w:line="240" w:lineRule="auto"/>
+        <w:spacing w:after="40"/>
       </w:pPr>
       <w:r>
         <w:rPr>
-          <w:rFonts w:ascii="Arial" w:hAnsi="Arial"/>
           <w:i/>
           <w:color w:val="707983"/>
           <w:sz w:val="17"/>
         </w:rPr>
-        <w:t>Wells Fargo · San Bernardino, CA · August 2016 – January 2018</w:t>
+        <w:t>Wells Fargo · San Bernardino, CA · August 2016 - January 2018</w:t>
       </w:r>
     </w:p>
     <w:p>
       <w:pPr>
         <w:pStyle w:val="ListBullet"/>
-        <w:spacing w:before="0" w:after="40" w:line="259" w:lineRule="auto"/>
-        <w:ind w:left="317" w:hanging="202"/>
+        <w:spacing w:after="20"/>
+        <w:ind w:left="288" w:hanging="187"/>
       </w:pPr>
       <w:r>
         <w:t>Assisted customers with account, billing, and service questions while de-escalating concerns and supporting new-hire training.</w:t>
@@ -572,54 +920,47 @@
     </w:p>
     <w:p>
       <w:pPr>
-        <w:spacing w:before="240" w:after="100" w:line="240" w:lineRule="auto"/>
-        <w:pBdr>
-          <w:bottom w:val="single" w:sz="6" w:space="1" w:color="D4D9DF"/>
-        </w:pBdr>
+        <w:spacing w:before="160" w:after="80"/>
       </w:pPr>
       <w:r>
         <w:rPr>
-          <w:rFonts w:ascii="Arial" w:hAnsi="Arial"/>
           <w:b/>
-          <w:color w:val="4F5964"/>
-          <w:sz w:val="19"/>
+          <w:color w:val="54616C"/>
+          <w:sz w:val="18"/>
         </w:rPr>
         <w:t>PROJECTS</w:t>
       </w:r>
     </w:p>
     <w:p>
       <w:pPr>
-        <w:spacing w:before="100" w:after="20" w:line="240" w:lineRule="auto"/>
+        <w:spacing w:after="20"/>
       </w:pPr>
       <w:r>
         <w:rPr>
-          <w:rFonts w:ascii="Arial" w:hAnsi="Arial"/>
           <w:b/>
-          <w:color w:val="171C22"/>
-          <w:sz w:val="22"/>
+          <w:sz w:val="21"/>
         </w:rPr>
         <w:t>Tempest eSports — Brand Strategy</w:t>
       </w:r>
     </w:p>
     <w:p>
       <w:pPr>
-        <w:spacing w:before="0" w:after="60" w:line="240" w:lineRule="auto"/>
+        <w:spacing w:after="40"/>
       </w:pPr>
       <w:r>
         <w:rPr>
-          <w:rFonts w:ascii="Arial" w:hAnsi="Arial"/>
           <w:i/>
           <w:color w:val="707983"/>
           <w:sz w:val="17"/>
         </w:rPr>
-        <w:t>Full Sail University · 2025 – Present</w:t>
+        <w:t>Full Sail University · 2025 - Present</w:t>
       </w:r>
     </w:p>
     <w:p>
       <w:pPr>
         <w:pStyle w:val="ListBullet"/>
-        <w:spacing w:before="0" w:after="40" w:line="259" w:lineRule="auto"/>
-        <w:ind w:left="317" w:hanging="202"/>
+        <w:spacing w:after="20"/>
+        <w:ind w:left="288" w:hanging="187"/>
       </w:pPr>
       <w:r>
         <w:t>Built a digital marketing strategy for an FPS-focused esports organization targeting Call of Duty, Valorant, Apex Legends, and Counter-Strike audiences.</w:t>
@@ -628,8 +969,8 @@
     <w:p>
       <w:pPr>
         <w:pStyle w:val="ListBullet"/>
-        <w:spacing w:before="0" w:after="40" w:line="259" w:lineRule="auto"/>
-        <w:ind w:left="317" w:hanging="202"/>
+        <w:spacing w:after="20"/>
+        <w:ind w:left="288" w:hanging="187"/>
       </w:pPr>
       <w:r>
         <w:t>Conducted competitive analysis of 100 Thieves, FaZe Clan, and Team Liquid and translated findings into positioning and content recommendations.</w:t>
@@ -638,301 +979,16 @@
     <w:p>
       <w:pPr>
         <w:pStyle w:val="ListBullet"/>
-        <w:spacing w:before="0" w:after="40" w:line="259" w:lineRule="auto"/>
-        <w:ind w:left="317" w:hanging="202"/>
+        <w:spacing w:after="20"/>
+        <w:ind w:left="288" w:hanging="187"/>
       </w:pPr>
       <w:r>
         <w:t>Designed a $15,000 Year 1 campaign budget with projected $162,000 revenue and KPI targets for growth and traffic.</w:t>
       </w:r>
     </w:p>
-    <w:p>
-      <w:pPr>
-        <w:spacing w:before="240" w:after="100" w:line="240" w:lineRule="auto"/>
-        <w:pBdr>
-          <w:bottom w:val="single" w:sz="6" w:space="1" w:color="D4D9DF"/>
-        </w:pBdr>
-      </w:pPr>
-      <w:r>
-        <w:rPr>
-          <w:rFonts w:ascii="Arial" w:hAnsi="Arial"/>
-          <w:b/>
-          <w:color w:val="4F5964"/>
-          <w:sz w:val="19"/>
-        </w:rPr>
-        <w:t>EDUCATION</w:t>
-      </w:r>
-    </w:p>
-    <w:p>
-      <w:pPr>
-        <w:spacing w:before="100" w:after="20" w:line="240" w:lineRule="auto"/>
-      </w:pPr>
-      <w:r>
-        <w:rPr>
-          <w:rFonts w:ascii="Arial" w:hAnsi="Arial"/>
-          <w:b/>
-          <w:color w:val="171C22"/>
-          <w:sz w:val="22"/>
-        </w:rPr>
-        <w:t>Master of Science, Entertainment Business</w:t>
-      </w:r>
-    </w:p>
-    <w:p>
-      <w:pPr>
-        <w:spacing w:before="0" w:after="60" w:line="240" w:lineRule="auto"/>
-      </w:pPr>
-      <w:r>
-        <w:rPr>
-          <w:rFonts w:ascii="Arial" w:hAnsi="Arial"/>
-          <w:i/>
-          <w:color w:val="707983"/>
-          <w:sz w:val="17"/>
-        </w:rPr>
-        <w:t>Full Sail University · September 2025 – Expected 2027</w:t>
-      </w:r>
-    </w:p>
-    <w:p>
-      <w:pPr>
-        <w:spacing w:before="100" w:after="20" w:line="240" w:lineRule="auto"/>
-      </w:pPr>
-      <w:r>
-        <w:rPr>
-          <w:rFonts w:ascii="Arial" w:hAnsi="Arial"/>
-          <w:b/>
-          <w:color w:val="171C22"/>
-          <w:sz w:val="22"/>
-        </w:rPr>
-        <w:t>Bachelor of Science, Esports Management, Production and Performance</w:t>
-      </w:r>
-    </w:p>
-    <w:p>
-      <w:pPr>
-        <w:spacing w:before="0" w:after="60" w:line="240" w:lineRule="auto"/>
-      </w:pPr>
-      <w:r>
-        <w:rPr>
-          <w:rFonts w:ascii="Arial" w:hAnsi="Arial"/>
-          <w:i/>
-          <w:color w:val="707983"/>
-          <w:sz w:val="17"/>
-        </w:rPr>
-        <w:t>Harrisburg University of Science and Technology · August 2022 – August 2025</w:t>
-      </w:r>
-    </w:p>
-    <w:p>
-      <w:pPr>
-        <w:spacing w:before="240" w:after="100" w:line="240" w:lineRule="auto"/>
-        <w:pBdr>
-          <w:bottom w:val="single" w:sz="6" w:space="1" w:color="D4D9DF"/>
-        </w:pBdr>
-      </w:pPr>
-      <w:r>
-        <w:rPr>
-          <w:rFonts w:ascii="Arial" w:hAnsi="Arial"/>
-          <w:b/>
-          <w:color w:val="4F5964"/>
-          <w:sz w:val="19"/>
-        </w:rPr>
-        <w:t>CERTIFICATIONS</w:t>
-      </w:r>
-    </w:p>
-    <w:p>
-      <w:pPr>
-        <w:spacing w:before="0" w:after="80" w:line="259" w:lineRule="auto"/>
-      </w:pPr>
-      <w:r>
-        <w:t>Platform Certifications</w:t>
-      </w:r>
-    </w:p>
-    <w:p>
-      <w:pPr>
-        <w:spacing w:before="0" w:after="80" w:line="259" w:lineRule="auto"/>
-      </w:pPr>
-      <w:r>
-        <w:t>LinkedIn Marketing Labs Certification · HubSpot Social Media Marketing Certification</w:t>
-      </w:r>
-    </w:p>
-    <w:p>
-      <w:pPr>
-        <w:spacing w:before="0" w:after="80" w:line="259" w:lineRule="auto"/>
-      </w:pPr>
-      <w:r>
-        <w:t>Marketing &amp; Digital</w:t>
-      </w:r>
-    </w:p>
-    <w:p>
-      <w:pPr>
-        <w:spacing w:before="0" w:after="80" w:line="259" w:lineRule="auto"/>
-      </w:pPr>
-      <w:r>
-        <w:t>Digital Marketing Foundations · Social Media Marketing Foundations · Content Marketing Foundations · SEO Foundations</w:t>
-      </w:r>
-    </w:p>
-    <w:p>
-      <w:pPr>
-        <w:spacing w:before="0" w:after="80" w:line="259" w:lineRule="auto"/>
-      </w:pPr>
-      <w:r>
-        <w:t>Business Analysis &amp; Project Management</w:t>
-      </w:r>
-    </w:p>
-    <w:p>
-      <w:pPr>
-        <w:spacing w:before="0" w:after="80" w:line="259" w:lineRule="auto"/>
-      </w:pPr>
-      <w:r>
-        <w:t>Business Analysis Foundations · Agile Requirements Foundations · Requirements Elicitation and Analysis</w:t>
-      </w:r>
-    </w:p>
-    <w:p>
-      <w:pPr>
-        <w:spacing w:before="0" w:after="80" w:line="259" w:lineRule="auto"/>
-      </w:pPr>
-      <w:r>
-        <w:t>Data &amp; Technology</w:t>
-      </w:r>
-    </w:p>
-    <w:p>
-      <w:pPr>
-        <w:spacing w:before="0" w:after="80" w:line="259" w:lineRule="auto"/>
-      </w:pPr>
-      <w:r>
-        <w:t>Learning Data Science: Understanding the Basics · Managing Data with Microsoft 365 · Figma Essential Training: The Basics</w:t>
-      </w:r>
-    </w:p>
-    <w:p>
-      <w:pPr>
-        <w:spacing w:before="240" w:after="100" w:line="240" w:lineRule="auto"/>
-        <w:pBdr>
-          <w:bottom w:val="single" w:sz="6" w:space="1" w:color="D4D9DF"/>
-        </w:pBdr>
-      </w:pPr>
-      <w:r>
-        <w:rPr>
-          <w:rFonts w:ascii="Arial" w:hAnsi="Arial"/>
-          <w:b/>
-          <w:color w:val="4F5964"/>
-          <w:sz w:val="19"/>
-        </w:rPr>
-        <w:t>SKILLS</w:t>
-      </w:r>
-    </w:p>
-    <w:p>
-      <w:pPr>
-        <w:spacing w:before="0" w:after="80" w:line="259" w:lineRule="auto"/>
-      </w:pPr>
-      <w:r>
-        <w:t>Community &amp; Audience</w:t>
-      </w:r>
-    </w:p>
-    <w:p>
-      <w:pPr>
-        <w:spacing w:before="0" w:after="80" w:line="259" w:lineRule="auto"/>
-      </w:pPr>
-      <w:r>
-        <w:t>Community Management · Discord Operations · Fan Engagement · Community Events · Moderation Systems</w:t>
-      </w:r>
-    </w:p>
-    <w:p>
-      <w:pPr>
-        <w:spacing w:before="0" w:after="80" w:line="259" w:lineRule="auto"/>
-      </w:pPr>
-      <w:r>
-        <w:t>Content &amp; Marketing</w:t>
-      </w:r>
-    </w:p>
-    <w:p>
-      <w:pPr>
-        <w:spacing w:before="0" w:after="80" w:line="259" w:lineRule="auto"/>
-      </w:pPr>
-      <w:r>
-        <w:t>Content Strategy · Content Writing · Content Scheduling · Social Media Marketing · Growth Marketing · SEO</w:t>
-      </w:r>
-    </w:p>
-    <w:p>
-      <w:pPr>
-        <w:spacing w:before="0" w:after="80" w:line="259" w:lineRule="auto"/>
-      </w:pPr>
-      <w:r>
-        <w:t>Esports &amp; Operations</w:t>
-      </w:r>
-    </w:p>
-    <w:p>
-      <w:pPr>
-        <w:spacing w:before="0" w:after="80" w:line="259" w:lineRule="auto"/>
-      </w:pPr>
-      <w:r>
-        <w:t>Tournament Operations · Sponsorship Development · Workflow Coordination · Documentation</w:t>
-      </w:r>
-    </w:p>
-    <w:p>
-      <w:pPr>
-        <w:spacing w:before="0" w:after="80" w:line="259" w:lineRule="auto"/>
-      </w:pPr>
-      <w:r>
-        <w:t>Analytics &amp; Support</w:t>
-      </w:r>
-    </w:p>
-    <w:p>
-      <w:pPr>
-        <w:spacing w:before="0" w:after="80" w:line="259" w:lineRule="auto"/>
-      </w:pPr>
-      <w:r>
-        <w:t>Engagement Tracking · Project Management · Customer Service · De-escalation · Technical Troubleshooting</w:t>
-      </w:r>
-    </w:p>
-    <w:p>
-      <w:pPr>
-        <w:spacing w:before="240" w:after="100" w:line="240" w:lineRule="auto"/>
-        <w:pBdr>
-          <w:bottom w:val="single" w:sz="6" w:space="1" w:color="D4D9DF"/>
-        </w:pBdr>
-      </w:pPr>
-      <w:r>
-        <w:rPr>
-          <w:rFonts w:ascii="Arial" w:hAnsi="Arial"/>
-          <w:b/>
-          <w:color w:val="4F5964"/>
-          <w:sz w:val="19"/>
-        </w:rPr>
-        <w:t>TOOLS</w:t>
-      </w:r>
-    </w:p>
-    <w:p>
-      <w:pPr>
-        <w:spacing w:before="0" w:after="80" w:line="259" w:lineRule="auto"/>
-      </w:pPr>
-      <w:r>
-        <w:t>Discord · Slack · Notion · Hootsuite · Zoho Social · Later · Canva · MEE6 · Dyno · HubSpot · Microsoft 365 · Google Workspace · Figma · OBS · Zoom · Twitch · YouTube</w:t>
-      </w:r>
-    </w:p>
-    <w:p>
-      <w:pPr>
-        <w:spacing w:before="240" w:after="100" w:line="240" w:lineRule="auto"/>
-        <w:pBdr>
-          <w:bottom w:val="single" w:sz="6" w:space="1" w:color="D4D9DF"/>
-        </w:pBdr>
-      </w:pPr>
-      <w:r>
-        <w:rPr>
-          <w:rFonts w:ascii="Arial" w:hAnsi="Arial"/>
-          <w:b/>
-          <w:color w:val="4F5964"/>
-          <w:sz w:val="19"/>
-        </w:rPr>
-        <w:t>LANGUAGES</w:t>
-      </w:r>
-    </w:p>
-    <w:p>
-      <w:pPr>
-        <w:spacing w:before="0" w:after="80" w:line="259" w:lineRule="auto"/>
-      </w:pPr>
-      <w:r>
-        <w:t>English (Native) · Spanish (Bilingual)</w:t>
-      </w:r>
-    </w:p>
     <w:sectPr>
       <w:pgSz w:w="12240" w:h="15840"/>
-      <w:pgMar w:top="1008" w:right="1008" w:bottom="1008" w:left="1008" w:header="720" w:footer="720" w:gutter="0"/>
+      <w:pgMar w:top="792" w:right="864" w:bottom="792" w:left="864" w:header="720" w:footer="720" w:gutter="0"/>
       <w:cols w:space="720"/>
       <w:docGrid w:linePitch="360"/>
     </w:sectPr>

</xml_diff>